<commit_message>
Fix python path for pytest in CI
</commit_message>
<xml_diff>
--- a/AIMLCZG523_Final_Report.docx
+++ b/AIMLCZG523_Final_Report.docx
@@ -100,21 +100,7 @@
         <w:rPr>
           <w:lang w:val="en-IN"/>
         </w:rPr>
-        <w:t>Clone the repository: git clone [</w:t>
-      </w:r>
-      <w:proofErr w:type="gramStart"/>
-      <w:r>
-        <w:rPr>
-          <w:lang w:val="en-IN"/>
-        </w:rPr>
-        <w:t>https://github.com/ssathishhkumarr/AIMLCZG523_Heart_Disease_Pipeline_2025AE05311](</w:t>
-      </w:r>
-      <w:proofErr w:type="gramEnd"/>
-      <w:r>
-        <w:rPr>
-          <w:lang w:val="en-IN"/>
-        </w:rPr>
-        <w:t>https://github.com/ssathishhkumarr/AIMLCZG523_Heart_Disease_Pipeline_2025AE05311)</w:t>
+        <w:t>Clone the repository: git clone [https://github.com/ssathishhkumarr/AIMLCZG523_Heart_Disease_Pipeline_2025AE05311](https://github.com/ssathishhkumarr/AIMLCZG523_Heart_Disease_Pipeline_2025AE05311)</w:t>
       </w:r>
     </w:p>
     <w:p>
@@ -148,63 +134,7 @@
         <w:rPr>
           <w:lang w:val="en-IN"/>
         </w:rPr>
-        <w:t xml:space="preserve">Create and activate a virtual environment: python -m </w:t>
-      </w:r>
-      <w:proofErr w:type="spellStart"/>
-      <w:r>
-        <w:rPr>
-          <w:lang w:val="en-IN"/>
-        </w:rPr>
-        <w:t>venv</w:t>
-      </w:r>
-      <w:proofErr w:type="spellEnd"/>
-      <w:r>
-        <w:rPr>
-          <w:lang w:val="en-IN"/>
-        </w:rPr>
-        <w:t xml:space="preserve"> </w:t>
-      </w:r>
-      <w:proofErr w:type="spellStart"/>
-      <w:r>
-        <w:rPr>
-          <w:lang w:val="en-IN"/>
-        </w:rPr>
-        <w:t>venv</w:t>
-      </w:r>
-      <w:proofErr w:type="spellEnd"/>
-      <w:r>
-        <w:rPr>
-          <w:lang w:val="en-IN"/>
-        </w:rPr>
-        <w:t xml:space="preserve"> followed by source </w:t>
-      </w:r>
-      <w:proofErr w:type="spellStart"/>
-      <w:r>
-        <w:rPr>
-          <w:lang w:val="en-IN"/>
-        </w:rPr>
-        <w:t>venv</w:t>
-      </w:r>
-      <w:proofErr w:type="spellEnd"/>
-      <w:r>
-        <w:rPr>
-          <w:lang w:val="en-IN"/>
-        </w:rPr>
-        <w:t xml:space="preserve">/bin/activate (Linux/Mac) or </w:t>
-      </w:r>
-      <w:proofErr w:type="spellStart"/>
-      <w:r>
-        <w:rPr>
-          <w:lang w:val="en-IN"/>
-        </w:rPr>
-        <w:t>venv</w:t>
-      </w:r>
-      <w:proofErr w:type="spellEnd"/>
-      <w:r>
-        <w:rPr>
-          <w:lang w:val="en-IN"/>
-        </w:rPr>
-        <w:t>\Scripts\activate (Windows).</w:t>
+        <w:t>Create and activate a virtual environment: python -m venv venv followed by source venv/bin/activate (Linux/Mac) or venv\Scripts\activate (Windows).</w:t>
       </w:r>
     </w:p>
     <w:p>
@@ -238,21 +168,7 @@
         <w:rPr>
           <w:lang w:val="en-IN"/>
         </w:rPr>
-        <w:t xml:space="preserve">Run unit tests to verify: </w:t>
-      </w:r>
-      <w:proofErr w:type="spellStart"/>
-      <w:r>
-        <w:rPr>
-          <w:lang w:val="en-IN"/>
-        </w:rPr>
-        <w:t>pytest</w:t>
-      </w:r>
-      <w:proofErr w:type="spellEnd"/>
-      <w:r>
-        <w:rPr>
-          <w:lang w:val="en-IN"/>
-        </w:rPr>
-        <w:t xml:space="preserve"> tests/</w:t>
+        <w:t>Run unit tests to verify: pytest tests/</w:t>
       </w:r>
     </w:p>
     <w:p>
@@ -774,47 +690,7 @@
         <w:t xml:space="preserve"> </w:t>
       </w:r>
       <w:r>
-        <w:t xml:space="preserve">Both models underwent systematic hyperparameter tuning using </w:t>
-      </w:r>
-      <w:proofErr w:type="spellStart"/>
-      <w:r>
-        <w:t>GridSearchCV</w:t>
-      </w:r>
-      <w:proofErr w:type="spellEnd"/>
-      <w:r>
-        <w:t xml:space="preserve"> with 5-fold cross-validation. For the Random Forest classifier, grid search optimized the </w:t>
-      </w:r>
-      <w:proofErr w:type="spellStart"/>
-      <w:r>
-        <w:t>n_estimators</w:t>
-      </w:r>
-      <w:proofErr w:type="spellEnd"/>
-      <w:r>
-        <w:t xml:space="preserve"> and </w:t>
-      </w:r>
-      <w:proofErr w:type="spellStart"/>
-      <w:r>
-        <w:t>max_depth</w:t>
-      </w:r>
-      <w:proofErr w:type="spellEnd"/>
-      <w:r>
-        <w:t xml:space="preserve"> parameters, while tuning the C parameter for Logistic Regression. The optimal hyperparameters for both models were automatically tracked and logged in </w:t>
-      </w:r>
-      <w:proofErr w:type="spellStart"/>
-      <w:r>
-        <w:t>MLflow</w:t>
-      </w:r>
-      <w:proofErr w:type="spellEnd"/>
-      <w:r>
-        <w:t xml:space="preserve">. Ultimately, the tuned Random Forest model was selected for production over the Logistic Regression baseline because its ensemble architecture captured the complex, non-linear relationships in the clinical health data more effectively. Demonstrating superior performance across Accuracy, Precision, Recall, and ROC-AUC metrics, the Random Forest model was serialized as </w:t>
-      </w:r>
-      <w:proofErr w:type="spellStart"/>
-      <w:r>
-        <w:t>model.pkl</w:t>
-      </w:r>
-      <w:proofErr w:type="spellEnd"/>
-      <w:r>
-        <w:t xml:space="preserve"> for deployment.</w:t>
+        <w:t>Both models underwent systematic hyperparameter tuning using GridSearchCV with 5-fold cross-validation. For the Random Forest classifier, grid search evaluated n_estimators [50, 100] and max_depth [None, 10]. The optimal parameters converged on n_estimators=100 and max_depth=None (mirroring the baseline configuration), while tuning the C parameter for Logistic Regression. The optimal hyperparameters were automatically tracked in MLflow. Ultimately, the tuned Random Forest model was selected for production because its ensemble architecture captured the complex, non-linear relationships in the clinical health data more effectively. Demonstrating superior performance across Accuracy, Precision, Recall, and ROC-AUC metrics, it was serialized as model.pkl for deployment.</w:t>
       </w:r>
       <w:r>
         <w:br w:type="page"/>
@@ -842,17 +718,13 @@
         <w:t>Pytest Execution:</w:t>
       </w:r>
     </w:p>
-    <w:p/>
     <w:p>
       <w:r>
-        <w:rPr>
-          <w:noProof/>
-        </w:rPr>
         <w:drawing>
-          <wp:inline distT="0" distB="0" distL="0" distR="0" wp14:anchorId="66148F47" wp14:editId="7478BE47">
-            <wp:extent cx="5486400" cy="1183005"/>
+          <wp:inline distT="0" distB="0" distL="0" distR="0" wp14:anchorId="3D169CE9" wp14:editId="24B0CB5C">
+            <wp:extent cx="5486400" cy="992505"/>
             <wp:effectExtent l="0" t="0" r="0" b="0"/>
-            <wp:docPr id="27479102" name="Picture 7"/>
+            <wp:docPr id="1431971296" name="Picture 1"/>
             <wp:cNvGraphicFramePr>
               <a:graphicFrameLocks xmlns:a="http://schemas.openxmlformats.org/drawingml/2006/main" noChangeAspect="1"/>
             </wp:cNvGraphicFramePr>
@@ -860,36 +732,23 @@
               <a:graphicData uri="http://schemas.openxmlformats.org/drawingml/2006/picture">
                 <pic:pic xmlns:pic="http://schemas.openxmlformats.org/drawingml/2006/picture">
                   <pic:nvPicPr>
-                    <pic:cNvPr id="0" name="Picture 16"/>
-                    <pic:cNvPicPr>
-                      <a:picLocks noChangeAspect="1" noChangeArrowheads="1"/>
-                    </pic:cNvPicPr>
+                    <pic:cNvPr id="1431971296" name=""/>
+                    <pic:cNvPicPr/>
                   </pic:nvPicPr>
                   <pic:blipFill>
-                    <a:blip r:embed="rId18">
-                      <a:extLst>
-                        <a:ext uri="{28A0092B-C50C-407E-A947-70E740481C1C}">
-                          <a14:useLocalDpi xmlns:a14="http://schemas.microsoft.com/office/drawing/2010/main" val="0"/>
-                        </a:ext>
-                      </a:extLst>
-                    </a:blip>
-                    <a:srcRect/>
+                    <a:blip r:embed="rId18"/>
                     <a:stretch>
                       <a:fillRect/>
                     </a:stretch>
                   </pic:blipFill>
-                  <pic:spPr bwMode="auto">
+                  <pic:spPr>
                     <a:xfrm>
                       <a:off x="0" y="0"/>
-                      <a:ext cx="5486400" cy="1183005"/>
+                      <a:ext cx="5486400" cy="992505"/>
                     </a:xfrm>
                     <a:prstGeom prst="rect">
                       <a:avLst/>
                     </a:prstGeom>
-                    <a:noFill/>
-                    <a:ln>
-                      <a:noFill/>
-                    </a:ln>
                   </pic:spPr>
                 </pic:pic>
               </a:graphicData>
@@ -899,8 +758,11 @@
       </w:r>
     </w:p>
     <w:p>
+      <w:pPr>
+        <w:pStyle w:val="ListBullet"/>
+      </w:pPr>
       <w:r>
-        <w:t>A Continuous Integration (CI) pipeline was established using GitHub Actions (ci.yml). This workflow automatically provisions an Ubuntu server, installs dependencies, and runs the pytest suite upon every push to the main branch.</w:t>
+        <w:t>A Continuous Integration (CI) pipeline was established using GitHub Actions (ci.yml). This workflow automatically provisions an Ubuntu server, installs dependencies, executes flake8 linting, runs the pytest suite, and executes model training upon every push to the main branch.</w:t>
       </w:r>
     </w:p>
     <w:p>
@@ -1169,23 +1031,7 @@
     </w:p>
     <w:p>
       <w:r>
-        <w:t xml:space="preserve">To satisfy production monitoring requirements, the </w:t>
-      </w:r>
-      <w:proofErr w:type="spellStart"/>
-      <w:r>
-        <w:t>FastAPI</w:t>
-      </w:r>
-      <w:proofErr w:type="spellEnd"/>
-      <w:r>
-        <w:t xml:space="preserve"> application was instrumented using the </w:t>
-      </w:r>
-      <w:proofErr w:type="spellStart"/>
-      <w:r>
-        <w:t>prometheus-fastapi-instrumentator</w:t>
-      </w:r>
-      <w:proofErr w:type="spellEnd"/>
-      <w:r>
-        <w:t xml:space="preserve"> library. This automatically tracks API request counts, latency, and response status codes, exposing them via a dedicated /metrics endpoint for Prometheus scraping.</w:t>
+        <w:t>To satisfy production monitoring requirements, the FastAPI application was instrumented using the prometheus-fastapi-instrumentator library. This automatically tracks API request counts, latency, and response status codes, exposing them via a dedicated /metrics endpoint for Prometheus scraping.</w:t>
       </w:r>
     </w:p>
     <w:p>
@@ -1246,6 +1092,11 @@
     </w:p>
     <w:p>
       <w:r>
+        <w:t>The /metrics endpoint dynamically exposes standard Prometheus-compatible metrics, including http_requests_total which accurately logs incoming /predict API traffic.</w:t>
+      </w:r>
+    </w:p>
+    <w:p>
+      <w:r>
         <w:rPr>
           <w:rFonts w:asciiTheme="majorHAnsi" w:eastAsiaTheme="majorEastAsia" w:hAnsiTheme="majorHAnsi" w:cstheme="majorBidi"/>
           <w:b/>
@@ -1273,38 +1124,20 @@
     </w:p>
     <w:p>
       <w:r>
-        <w:t xml:space="preserve">To ensure high availability and scalability, the </w:t>
-      </w:r>
-      <w:proofErr w:type="spellStart"/>
-      <w:r>
-        <w:t>Dockerized</w:t>
-      </w:r>
-      <w:proofErr w:type="spellEnd"/>
-      <w:r>
-        <w:t xml:space="preserve"> API was deployed to a local Kubernetes cluster using a deployment manifest (k8s-</w:t>
-      </w:r>
-      <w:proofErr w:type="gramStart"/>
-      <w:r>
-        <w:t>manifest.yaml</w:t>
-      </w:r>
-      <w:proofErr w:type="gramEnd"/>
-      <w:r>
-        <w:t xml:space="preserve">). The application was exposed to external traffic using a </w:t>
-      </w:r>
-      <w:proofErr w:type="spellStart"/>
-      <w:r>
-        <w:t>LoadBalancer</w:t>
-      </w:r>
-      <w:proofErr w:type="spellEnd"/>
-      <w:r>
-        <w:t xml:space="preserve"> service, fulfilling production-readiness requirements for cloud deployment.</w:t>
+        <w:t>To ensure high availability and scalability, the Dockerized API was deployed to a local Kubernetes cluster using a deployment manifest (k8s-manifest.yaml). The application was exposed to external traffic using a LoadBalancer service, fulfilling production-readiness requirements for cloud deployment.</w:t>
       </w:r>
     </w:p>
     <w:p>
+      <w:pPr>
+        <w:rPr>
+          <w:noProof/>
+        </w:rPr>
+      </w:pPr>
       <w:r>
         <w:rPr>
           <w:noProof/>
         </w:rPr>
+        <w:lastRenderedPageBreak/>
         <w:drawing>
           <wp:inline distT="0" distB="0" distL="0" distR="0" wp14:anchorId="5194F0AF" wp14:editId="6E428C09">
             <wp:extent cx="5486400" cy="710565"/>
@@ -1354,13 +1187,57 @@
           </wp:inline>
         </w:drawing>
       </w:r>
+      <w:r>
+        <w:rPr>
+          <w:noProof/>
+        </w:rPr>
+        <w:t xml:space="preserve"> </w:t>
+      </w:r>
+    </w:p>
+    <w:p>
+      <w:r>
+        <w:drawing>
+          <wp:inline distT="0" distB="0" distL="0" distR="0" wp14:anchorId="4B23F02E" wp14:editId="4683D833">
+            <wp:extent cx="5486400" cy="2311400"/>
+            <wp:effectExtent l="0" t="0" r="0" b="0"/>
+            <wp:docPr id="710957450" name="Picture 1"/>
+            <wp:cNvGraphicFramePr>
+              <a:graphicFrameLocks xmlns:a="http://schemas.openxmlformats.org/drawingml/2006/main" noChangeAspect="1"/>
+            </wp:cNvGraphicFramePr>
+            <a:graphic xmlns:a="http://schemas.openxmlformats.org/drawingml/2006/main">
+              <a:graphicData uri="http://schemas.openxmlformats.org/drawingml/2006/picture">
+                <pic:pic xmlns:pic="http://schemas.openxmlformats.org/drawingml/2006/picture">
+                  <pic:nvPicPr>
+                    <pic:cNvPr id="710957450" name=""/>
+                    <pic:cNvPicPr/>
+                  </pic:nvPicPr>
+                  <pic:blipFill>
+                    <a:blip r:embed="rId24"/>
+                    <a:stretch>
+                      <a:fillRect/>
+                    </a:stretch>
+                  </pic:blipFill>
+                  <pic:spPr>
+                    <a:xfrm>
+                      <a:off x="0" y="0"/>
+                      <a:ext cx="5486400" cy="2311400"/>
+                    </a:xfrm>
+                    <a:prstGeom prst="rect">
+                      <a:avLst/>
+                    </a:prstGeom>
+                  </pic:spPr>
+                </pic:pic>
+              </a:graphicData>
+            </a:graphic>
+          </wp:inline>
+        </w:drawing>
+      </w:r>
     </w:p>
     <w:p>
       <w:pPr>
         <w:pStyle w:val="Heading1"/>
       </w:pPr>
       <w:r>
-        <w:lastRenderedPageBreak/>
         <w:t>9</w:t>
       </w:r>
       <w:r>
@@ -1369,15 +1246,13 @@
     </w:p>
     <w:p>
       <w:r>
-        <w:t xml:space="preserve">This project successfully implemented a complete </w:t>
+        <w:t xml:space="preserve">This project successfully implemented a complete MLOps lifecycle for heart disease prediction. The pipeline encompasses data ingestion and analysis, model training with experiment tracking, automated testing via CI/CD, containerization, deployment to a local Kubernetes cluster (Docker Desktop), and </w:t>
       </w:r>
-      <w:proofErr w:type="spellStart"/>
       <w:r>
-        <w:t>MLOps</w:t>
+        <w:t>Prometheus-compatible metric exposure</w:t>
       </w:r>
-      <w:proofErr w:type="spellEnd"/>
       <w:r>
-        <w:t xml:space="preserve"> lifecycle for heart disease prediction. The pipeline encompasses data ingestion and analysis, model training with experiment tracking, automated testing via CI/CD, containerization, deployment to a local Kubernetes cluster (Docker Desktop), and live Prometheus monitoring, fulfilling all technical requirements for a production-ready machine learning system.</w:t>
+        <w:t>, fulfilling all technical requirements for a production-ready machine learning system.</w:t>
       </w:r>
     </w:p>
     <w:sectPr>

</xml_diff>

<commit_message>
Final MLOps pipeline and documentation update
</commit_message>
<xml_diff>
--- a/AIMLCZG523_Final_Report.docx
+++ b/AIMLCZG523_Final_Report.docx
@@ -235,9 +235,9 @@
           <w:noProof/>
         </w:rPr>
         <w:drawing>
-          <wp:inline distT="0" distB="0" distL="0" distR="0" wp14:anchorId="02CDE8D0" wp14:editId="399DDE3C">
-            <wp:extent cx="5486400" cy="3200400"/>
-            <wp:effectExtent l="0" t="0" r="38100" b="0"/>
+          <wp:inline distT="0" distB="0" distL="0" distR="0" wp14:anchorId="02CDE8D0" wp14:editId="19137354">
+            <wp:extent cx="4556760" cy="2438400"/>
+            <wp:effectExtent l="0" t="0" r="34290" b="0"/>
             <wp:docPr id="536873007" name="Diagram 3"/>
             <wp:cNvGraphicFramePr/>
             <a:graphic xmlns:a="http://schemas.openxmlformats.org/drawingml/2006/main">
@@ -262,18 +262,6 @@
         <w:t>The dataset was loaded and cleaned using the data_loader.py script. Initial exploratory analysis was performed to understand feature distributions, class balance, and correlations.</w:t>
       </w:r>
     </w:p>
-    <w:p/>
-    <w:p/>
-    <w:p/>
-    <w:p/>
-    <w:p/>
-    <w:p/>
-    <w:p/>
-    <w:p/>
-    <w:p/>
-    <w:p/>
-    <w:p/>
-    <w:p/>
     <w:p>
       <w:pPr>
         <w:pStyle w:val="ListBullet"/>
@@ -282,16 +270,20 @@
         <w:t>Class Balance:</w:t>
       </w:r>
     </w:p>
-    <w:p/>
+    <w:p>
+      <w:r>
+        <w:t>Figure 1: Class balance of the target variable</w:t>
+      </w:r>
+    </w:p>
     <w:p>
       <w:r>
         <w:rPr>
           <w:noProof/>
         </w:rPr>
         <w:drawing>
-          <wp:inline distT="0" distB="0" distL="0" distR="0" wp14:anchorId="5D0B18A1" wp14:editId="4F750F1F">
-            <wp:extent cx="4962525" cy="3629025"/>
-            <wp:effectExtent l="0" t="0" r="9525" b="9525"/>
+          <wp:inline distT="0" distB="0" distL="0" distR="0" wp14:anchorId="5D0B18A1" wp14:editId="2C208831">
+            <wp:extent cx="3223260" cy="2357125"/>
+            <wp:effectExtent l="0" t="0" r="0" b="5080"/>
             <wp:docPr id="430367344" name="Picture 1"/>
             <wp:cNvGraphicFramePr>
               <a:graphicFrameLocks xmlns:a="http://schemas.openxmlformats.org/drawingml/2006/main" noChangeAspect="1"/>
@@ -321,7 +313,7 @@
                   <pic:spPr bwMode="auto">
                     <a:xfrm>
                       <a:off x="0" y="0"/>
-                      <a:ext cx="4962525" cy="3629025"/>
+                      <a:ext cx="3228723" cy="2361120"/>
                     </a:xfrm>
                     <a:prstGeom prst="rect">
                       <a:avLst/>
@@ -342,32 +334,29 @@
     <w:p/>
     <w:p/>
     <w:p/>
-    <w:p/>
-    <w:p/>
-    <w:p/>
-    <w:p/>
-    <w:p/>
-    <w:p/>
-    <w:p/>
-    <w:p/>
     <w:p>
       <w:pPr>
         <w:pStyle w:val="ListBullet"/>
       </w:pPr>
       <w:r>
+        <w:lastRenderedPageBreak/>
         <w:t>Feature Distributions (Histograms):</w:t>
       </w:r>
     </w:p>
-    <w:p/>
+    <w:p>
+      <w:r>
+        <w:t>Figure 2: Histograms showing the distribution of key numerical features</w:t>
+      </w:r>
+    </w:p>
     <w:p>
       <w:r>
         <w:rPr>
           <w:noProof/>
         </w:rPr>
         <w:drawing>
-          <wp:inline distT="0" distB="0" distL="0" distR="0" wp14:anchorId="04C976A2" wp14:editId="502664CB">
-            <wp:extent cx="5486400" cy="4126230"/>
-            <wp:effectExtent l="0" t="0" r="0" b="7620"/>
+          <wp:inline distT="0" distB="0" distL="0" distR="0" wp14:anchorId="04C976A2" wp14:editId="6D2CD11C">
+            <wp:extent cx="4145280" cy="3117596"/>
+            <wp:effectExtent l="0" t="0" r="7620" b="6985"/>
             <wp:docPr id="834915653" name="Picture 3"/>
             <wp:cNvGraphicFramePr>
               <a:graphicFrameLocks xmlns:a="http://schemas.openxmlformats.org/drawingml/2006/main" noChangeAspect="1"/>
@@ -397,7 +386,7 @@
                   <pic:spPr bwMode="auto">
                     <a:xfrm>
                       <a:off x="0" y="0"/>
-                      <a:ext cx="5486400" cy="4126230"/>
+                      <a:ext cx="4149558" cy="3120813"/>
                     </a:xfrm>
                     <a:prstGeom prst="rect">
                       <a:avLst/>
@@ -414,16 +403,16 @@
         </w:drawing>
       </w:r>
     </w:p>
-    <w:p/>
-    <w:p/>
-    <w:p/>
-    <w:p/>
-    <w:p/>
-    <w:p/>
-    <w:p/>
-    <w:p/>
-    <w:p/>
-    <w:p/>
+    <w:p>
+      <w:pPr>
+        <w:pStyle w:val="ListBullet"/>
+        <w:numPr>
+          <w:ilvl w:val="0"/>
+          <w:numId w:val="0"/>
+        </w:numPr>
+        <w:ind w:left="360"/>
+      </w:pPr>
+    </w:p>
     <w:p>
       <w:pPr>
         <w:pStyle w:val="ListBullet"/>
@@ -432,15 +421,17 @@
         <w:t>Correlation Heatmap:</w:t>
       </w:r>
     </w:p>
-    <w:p/>
     <w:p>
+      <w:r>
+        <w:t xml:space="preserve">Figure 3: Feature correlation heatmap showing relationships between the clinical variables </w:t>
+      </w:r>
       <w:r>
         <w:rPr>
           <w:noProof/>
         </w:rPr>
         <w:drawing>
-          <wp:inline distT="0" distB="0" distL="0" distR="0" wp14:anchorId="5380D955" wp14:editId="667B9203">
-            <wp:extent cx="5486400" cy="5031740"/>
+          <wp:inline distT="0" distB="0" distL="0" distR="0" wp14:anchorId="5380D955" wp14:editId="65E882A8">
+            <wp:extent cx="3886200" cy="3564149"/>
             <wp:effectExtent l="0" t="0" r="0" b="0"/>
             <wp:docPr id="1057362701" name="Picture 4"/>
             <wp:cNvGraphicFramePr>
@@ -471,7 +462,7 @@
                   <pic:spPr bwMode="auto">
                     <a:xfrm>
                       <a:off x="0" y="0"/>
-                      <a:ext cx="5486400" cy="5031740"/>
+                      <a:ext cx="3890452" cy="3568049"/>
                     </a:xfrm>
                     <a:prstGeom prst="rect">
                       <a:avLst/>
@@ -486,11 +477,6 @@
             </a:graphic>
           </wp:inline>
         </w:drawing>
-      </w:r>
-    </w:p>
-    <w:p>
-      <w:r>
-        <w:br w:type="page"/>
       </w:r>
     </w:p>
     <w:p>
@@ -515,16 +501,20 @@
         <w:t>MLflow Tracking - Random Forest:</w:t>
       </w:r>
     </w:p>
-    <w:p/>
+    <w:p>
+      <w:r>
+        <w:t>Figure 4: MLflow tracking UI displaying the Random Forest model run metrics and parameters</w:t>
+      </w:r>
+    </w:p>
     <w:p>
       <w:r>
         <w:rPr>
           <w:noProof/>
         </w:rPr>
         <w:drawing>
-          <wp:inline distT="0" distB="0" distL="0" distR="0" wp14:anchorId="17AF6B47" wp14:editId="0B57F5FC">
-            <wp:extent cx="5486400" cy="3839210"/>
-            <wp:effectExtent l="0" t="0" r="0" b="8890"/>
+          <wp:inline distT="0" distB="0" distL="0" distR="0" wp14:anchorId="17AF6B47" wp14:editId="7A532E41">
+            <wp:extent cx="4747260" cy="3321983"/>
+            <wp:effectExtent l="0" t="0" r="0" b="0"/>
             <wp:docPr id="1388338387" name="Picture 8"/>
             <wp:cNvGraphicFramePr>
               <a:graphicFrameLocks xmlns:a="http://schemas.openxmlformats.org/drawingml/2006/main" noChangeAspect="1"/>
@@ -554,7 +544,7 @@
                   <pic:spPr bwMode="auto">
                     <a:xfrm>
                       <a:off x="0" y="0"/>
-                      <a:ext cx="5486400" cy="3839210"/>
+                      <a:ext cx="4754923" cy="3327345"/>
                     </a:xfrm>
                     <a:prstGeom prst="rect">
                       <a:avLst/>
@@ -584,10 +574,15 @@
         <w:pStyle w:val="ListBullet"/>
       </w:pPr>
       <w:r>
+        <w:lastRenderedPageBreak/>
         <w:t>MLflow Tracking - Logistic Regression:</w:t>
       </w:r>
     </w:p>
-    <w:p/>
+    <w:p>
+      <w:r>
+        <w:t>Figure 5: MLflow tracking UI for the Logistic Regression model run</w:t>
+      </w:r>
+    </w:p>
     <w:p>
       <w:pPr>
         <w:rPr>
@@ -600,9 +595,9 @@
           <w:noProof/>
         </w:rPr>
         <w:drawing>
-          <wp:inline distT="0" distB="0" distL="0" distR="0" wp14:anchorId="214EBC81" wp14:editId="7F6BEABD">
-            <wp:extent cx="5486400" cy="3502660"/>
-            <wp:effectExtent l="0" t="0" r="0" b="2540"/>
+          <wp:inline distT="0" distB="0" distL="0" distR="0" wp14:anchorId="214EBC81" wp14:editId="776B6581">
+            <wp:extent cx="4335780" cy="2768074"/>
+            <wp:effectExtent l="0" t="0" r="7620" b="0"/>
             <wp:docPr id="2038695750" name="Picture 6"/>
             <wp:cNvGraphicFramePr>
               <a:graphicFrameLocks xmlns:a="http://schemas.openxmlformats.org/drawingml/2006/main" noChangeAspect="1"/>
@@ -632,7 +627,7 @@
                   <pic:spPr bwMode="auto">
                     <a:xfrm>
                       <a:off x="0" y="0"/>
-                      <a:ext cx="5486400" cy="3502660"/>
+                      <a:ext cx="4345287" cy="2774143"/>
                     </a:xfrm>
                     <a:prstGeom prst="rect">
                       <a:avLst/>
@@ -656,6 +651,544 @@
         <w:t xml:space="preserve"> </w:t>
       </w:r>
     </w:p>
+    <w:p>
+      <w:pPr>
+        <w:rPr>
+          <w:b/>
+          <w:bCs/>
+        </w:rPr>
+      </w:pPr>
+    </w:p>
+    <w:tbl>
+      <w:tblPr>
+        <w:tblW w:w="4391" w:type="pct"/>
+        <w:tblCellSpacing w:w="15" w:type="dxa"/>
+        <w:tblCellMar>
+          <w:left w:w="0" w:type="dxa"/>
+          <w:right w:w="0" w:type="dxa"/>
+        </w:tblCellMar>
+        <w:tblLook w:val="04A0" w:firstRow="1" w:lastRow="0" w:firstColumn="1" w:lastColumn="0" w:noHBand="0" w:noVBand="1"/>
+      </w:tblPr>
+      <w:tblGrid>
+        <w:gridCol w:w="1593"/>
+        <w:gridCol w:w="1439"/>
+        <w:gridCol w:w="1341"/>
+        <w:gridCol w:w="1374"/>
+        <w:gridCol w:w="1039"/>
+        <w:gridCol w:w="1197"/>
+      </w:tblGrid>
+      <w:tr>
+        <w:trPr>
+          <w:trHeight w:val="571"/>
+          <w:tblHeader/>
+          <w:tblCellSpacing w:w="15" w:type="dxa"/>
+        </w:trPr>
+        <w:tc>
+          <w:tcPr>
+            <w:tcW w:w="1065" w:type="pct"/>
+            <w:tcBorders>
+              <w:top w:val="single" w:sz="6" w:space="0" w:color="C4C7C5"/>
+              <w:left w:val="single" w:sz="6" w:space="0" w:color="C4C7C5"/>
+              <w:bottom w:val="single" w:sz="6" w:space="0" w:color="C4C7C5"/>
+              <w:right w:val="single" w:sz="6" w:space="0" w:color="C4C7C5"/>
+            </w:tcBorders>
+            <w:tcMar>
+              <w:top w:w="120" w:type="dxa"/>
+              <w:left w:w="180" w:type="dxa"/>
+              <w:bottom w:w="120" w:type="dxa"/>
+              <w:right w:w="180" w:type="dxa"/>
+            </w:tcMar>
+            <w:vAlign w:val="center"/>
+            <w:hideMark/>
+          </w:tcPr>
+          <w:p>
+            <w:pPr>
+              <w:rPr>
+                <w:b/>
+                <w:bCs/>
+              </w:rPr>
+            </w:pPr>
+            <w:r>
+              <w:rPr>
+                <w:b/>
+                <w:bCs/>
+              </w:rPr>
+              <w:t>Model</w:t>
+            </w:r>
+          </w:p>
+        </w:tc>
+        <w:tc>
+          <w:tcPr>
+            <w:tcW w:w="978" w:type="pct"/>
+            <w:tcBorders>
+              <w:top w:val="single" w:sz="6" w:space="0" w:color="C4C7C5"/>
+              <w:left w:val="single" w:sz="6" w:space="0" w:color="C4C7C5"/>
+              <w:bottom w:val="single" w:sz="6" w:space="0" w:color="C4C7C5"/>
+              <w:right w:val="single" w:sz="6" w:space="0" w:color="C4C7C5"/>
+            </w:tcBorders>
+            <w:tcMar>
+              <w:top w:w="120" w:type="dxa"/>
+              <w:left w:w="180" w:type="dxa"/>
+              <w:bottom w:w="120" w:type="dxa"/>
+              <w:right w:w="180" w:type="dxa"/>
+            </w:tcMar>
+            <w:vAlign w:val="center"/>
+            <w:hideMark/>
+          </w:tcPr>
+          <w:p>
+            <w:pPr>
+              <w:rPr>
+                <w:b/>
+                <w:bCs/>
+              </w:rPr>
+            </w:pPr>
+            <w:r>
+              <w:rPr>
+                <w:b/>
+                <w:bCs/>
+              </w:rPr>
+              <w:t>CV ROC-AUC Mean</w:t>
+            </w:r>
+          </w:p>
+        </w:tc>
+        <w:tc>
+          <w:tcPr>
+            <w:tcW w:w="719" w:type="pct"/>
+            <w:tcBorders>
+              <w:top w:val="single" w:sz="6" w:space="0" w:color="C4C7C5"/>
+              <w:left w:val="single" w:sz="6" w:space="0" w:color="C4C7C5"/>
+              <w:bottom w:val="single" w:sz="6" w:space="0" w:color="C4C7C5"/>
+              <w:right w:val="single" w:sz="6" w:space="0" w:color="C4C7C5"/>
+            </w:tcBorders>
+            <w:tcMar>
+              <w:top w:w="120" w:type="dxa"/>
+              <w:left w:w="180" w:type="dxa"/>
+              <w:bottom w:w="120" w:type="dxa"/>
+              <w:right w:w="180" w:type="dxa"/>
+            </w:tcMar>
+            <w:vAlign w:val="center"/>
+            <w:hideMark/>
+          </w:tcPr>
+          <w:p>
+            <w:pPr>
+              <w:rPr>
+                <w:b/>
+                <w:bCs/>
+              </w:rPr>
+            </w:pPr>
+            <w:r>
+              <w:rPr>
+                <w:b/>
+                <w:bCs/>
+              </w:rPr>
+              <w:t>Accuracy</w:t>
+            </w:r>
+          </w:p>
+        </w:tc>
+        <w:tc>
+          <w:tcPr>
+            <w:tcW w:w="737" w:type="pct"/>
+            <w:tcBorders>
+              <w:top w:val="single" w:sz="6" w:space="0" w:color="C4C7C5"/>
+              <w:left w:val="single" w:sz="6" w:space="0" w:color="C4C7C5"/>
+              <w:bottom w:val="single" w:sz="6" w:space="0" w:color="C4C7C5"/>
+              <w:right w:val="single" w:sz="6" w:space="0" w:color="C4C7C5"/>
+            </w:tcBorders>
+            <w:tcMar>
+              <w:top w:w="120" w:type="dxa"/>
+              <w:left w:w="180" w:type="dxa"/>
+              <w:bottom w:w="120" w:type="dxa"/>
+              <w:right w:w="180" w:type="dxa"/>
+            </w:tcMar>
+            <w:vAlign w:val="center"/>
+            <w:hideMark/>
+          </w:tcPr>
+          <w:p>
+            <w:pPr>
+              <w:rPr>
+                <w:b/>
+                <w:bCs/>
+              </w:rPr>
+            </w:pPr>
+            <w:r>
+              <w:rPr>
+                <w:b/>
+                <w:bCs/>
+              </w:rPr>
+              <w:t>Precision</w:t>
+            </w:r>
+          </w:p>
+        </w:tc>
+        <w:tc>
+          <w:tcPr>
+            <w:tcW w:w="552" w:type="pct"/>
+            <w:tcBorders>
+              <w:top w:val="single" w:sz="6" w:space="0" w:color="C4C7C5"/>
+              <w:left w:val="single" w:sz="6" w:space="0" w:color="C4C7C5"/>
+              <w:bottom w:val="single" w:sz="6" w:space="0" w:color="C4C7C5"/>
+              <w:right w:val="single" w:sz="6" w:space="0" w:color="C4C7C5"/>
+            </w:tcBorders>
+            <w:tcMar>
+              <w:top w:w="120" w:type="dxa"/>
+              <w:left w:w="180" w:type="dxa"/>
+              <w:bottom w:w="120" w:type="dxa"/>
+              <w:right w:w="180" w:type="dxa"/>
+            </w:tcMar>
+            <w:vAlign w:val="center"/>
+            <w:hideMark/>
+          </w:tcPr>
+          <w:p>
+            <w:pPr>
+              <w:rPr>
+                <w:b/>
+                <w:bCs/>
+              </w:rPr>
+            </w:pPr>
+            <w:r>
+              <w:rPr>
+                <w:b/>
+                <w:bCs/>
+              </w:rPr>
+              <w:t>Recall</w:t>
+            </w:r>
+          </w:p>
+        </w:tc>
+        <w:tc>
+          <w:tcPr>
+            <w:tcW w:w="817" w:type="pct"/>
+            <w:tcBorders>
+              <w:top w:val="single" w:sz="6" w:space="0" w:color="C4C7C5"/>
+              <w:left w:val="single" w:sz="6" w:space="0" w:color="C4C7C5"/>
+              <w:bottom w:val="single" w:sz="6" w:space="0" w:color="C4C7C5"/>
+              <w:right w:val="single" w:sz="6" w:space="0" w:color="C4C7C5"/>
+            </w:tcBorders>
+            <w:tcMar>
+              <w:top w:w="120" w:type="dxa"/>
+              <w:left w:w="180" w:type="dxa"/>
+              <w:bottom w:w="120" w:type="dxa"/>
+              <w:right w:w="180" w:type="dxa"/>
+            </w:tcMar>
+            <w:vAlign w:val="center"/>
+            <w:hideMark/>
+          </w:tcPr>
+          <w:p>
+            <w:pPr>
+              <w:rPr>
+                <w:b/>
+                <w:bCs/>
+              </w:rPr>
+            </w:pPr>
+            <w:r>
+              <w:rPr>
+                <w:b/>
+                <w:bCs/>
+              </w:rPr>
+              <w:t>Test ROC-AUC</w:t>
+            </w:r>
+          </w:p>
+        </w:tc>
+      </w:tr>
+      <w:tr>
+        <w:trPr>
+          <w:trHeight w:val="571"/>
+          <w:tblCellSpacing w:w="15" w:type="dxa"/>
+        </w:trPr>
+        <w:tc>
+          <w:tcPr>
+            <w:tcW w:w="1065" w:type="pct"/>
+            <w:tcBorders>
+              <w:top w:val="single" w:sz="6" w:space="0" w:color="C4C7C5"/>
+              <w:left w:val="single" w:sz="6" w:space="0" w:color="C4C7C5"/>
+              <w:bottom w:val="single" w:sz="6" w:space="0" w:color="C4C7C5"/>
+              <w:right w:val="single" w:sz="6" w:space="0" w:color="C4C7C5"/>
+            </w:tcBorders>
+            <w:tcMar>
+              <w:top w:w="120" w:type="dxa"/>
+              <w:left w:w="180" w:type="dxa"/>
+              <w:bottom w:w="120" w:type="dxa"/>
+              <w:right w:w="180" w:type="dxa"/>
+            </w:tcMar>
+            <w:vAlign w:val="center"/>
+            <w:hideMark/>
+          </w:tcPr>
+          <w:p>
+            <w:r>
+              <w:t>Logistic Regression</w:t>
+            </w:r>
+          </w:p>
+        </w:tc>
+        <w:tc>
+          <w:tcPr>
+            <w:tcW w:w="978" w:type="pct"/>
+            <w:tcBorders>
+              <w:top w:val="single" w:sz="6" w:space="0" w:color="C4C7C5"/>
+              <w:left w:val="single" w:sz="6" w:space="0" w:color="C4C7C5"/>
+              <w:bottom w:val="single" w:sz="6" w:space="0" w:color="C4C7C5"/>
+              <w:right w:val="single" w:sz="6" w:space="0" w:color="C4C7C5"/>
+            </w:tcBorders>
+            <w:tcMar>
+              <w:top w:w="120" w:type="dxa"/>
+              <w:left w:w="180" w:type="dxa"/>
+              <w:bottom w:w="120" w:type="dxa"/>
+              <w:right w:w="180" w:type="dxa"/>
+            </w:tcMar>
+            <w:vAlign w:val="center"/>
+            <w:hideMark/>
+          </w:tcPr>
+          <w:p>
+            <w:r>
+              <w:t>0.908</w:t>
+            </w:r>
+          </w:p>
+        </w:tc>
+        <w:tc>
+          <w:tcPr>
+            <w:tcW w:w="719" w:type="pct"/>
+            <w:tcBorders>
+              <w:top w:val="single" w:sz="6" w:space="0" w:color="C4C7C5"/>
+              <w:left w:val="single" w:sz="6" w:space="0" w:color="C4C7C5"/>
+              <w:bottom w:val="single" w:sz="6" w:space="0" w:color="C4C7C5"/>
+              <w:right w:val="single" w:sz="6" w:space="0" w:color="C4C7C5"/>
+            </w:tcBorders>
+            <w:tcMar>
+              <w:top w:w="120" w:type="dxa"/>
+              <w:left w:w="180" w:type="dxa"/>
+              <w:bottom w:w="120" w:type="dxa"/>
+              <w:right w:w="180" w:type="dxa"/>
+            </w:tcMar>
+            <w:vAlign w:val="center"/>
+            <w:hideMark/>
+          </w:tcPr>
+          <w:p>
+            <w:r>
+              <w:t>0.836</w:t>
+            </w:r>
+          </w:p>
+        </w:tc>
+        <w:tc>
+          <w:tcPr>
+            <w:tcW w:w="737" w:type="pct"/>
+            <w:tcBorders>
+              <w:top w:val="single" w:sz="6" w:space="0" w:color="C4C7C5"/>
+              <w:left w:val="single" w:sz="6" w:space="0" w:color="C4C7C5"/>
+              <w:bottom w:val="single" w:sz="6" w:space="0" w:color="C4C7C5"/>
+              <w:right w:val="single" w:sz="6" w:space="0" w:color="C4C7C5"/>
+            </w:tcBorders>
+            <w:tcMar>
+              <w:top w:w="120" w:type="dxa"/>
+              <w:left w:w="180" w:type="dxa"/>
+              <w:bottom w:w="120" w:type="dxa"/>
+              <w:right w:w="180" w:type="dxa"/>
+            </w:tcMar>
+            <w:vAlign w:val="center"/>
+            <w:hideMark/>
+          </w:tcPr>
+          <w:p>
+            <w:r>
+              <w:t>0.823</w:t>
+            </w:r>
+          </w:p>
+        </w:tc>
+        <w:tc>
+          <w:tcPr>
+            <w:tcW w:w="552" w:type="pct"/>
+            <w:tcBorders>
+              <w:top w:val="single" w:sz="6" w:space="0" w:color="C4C7C5"/>
+              <w:left w:val="single" w:sz="6" w:space="0" w:color="C4C7C5"/>
+              <w:bottom w:val="single" w:sz="6" w:space="0" w:color="C4C7C5"/>
+              <w:right w:val="single" w:sz="6" w:space="0" w:color="C4C7C5"/>
+            </w:tcBorders>
+            <w:tcMar>
+              <w:top w:w="120" w:type="dxa"/>
+              <w:left w:w="180" w:type="dxa"/>
+              <w:bottom w:w="120" w:type="dxa"/>
+              <w:right w:w="180" w:type="dxa"/>
+            </w:tcMar>
+            <w:vAlign w:val="center"/>
+            <w:hideMark/>
+          </w:tcPr>
+          <w:p>
+            <w:r>
+              <w:t>0.875</w:t>
+            </w:r>
+          </w:p>
+        </w:tc>
+        <w:tc>
+          <w:tcPr>
+            <w:tcW w:w="817" w:type="pct"/>
+            <w:tcBorders>
+              <w:top w:val="single" w:sz="6" w:space="0" w:color="C4C7C5"/>
+              <w:left w:val="single" w:sz="6" w:space="0" w:color="C4C7C5"/>
+              <w:bottom w:val="single" w:sz="6" w:space="0" w:color="C4C7C5"/>
+              <w:right w:val="single" w:sz="6" w:space="0" w:color="C4C7C5"/>
+            </w:tcBorders>
+            <w:tcMar>
+              <w:top w:w="120" w:type="dxa"/>
+              <w:left w:w="180" w:type="dxa"/>
+              <w:bottom w:w="120" w:type="dxa"/>
+              <w:right w:w="180" w:type="dxa"/>
+            </w:tcMar>
+            <w:vAlign w:val="center"/>
+            <w:hideMark/>
+          </w:tcPr>
+          <w:p>
+            <w:r>
+              <w:t>0.910</w:t>
+            </w:r>
+          </w:p>
+        </w:tc>
+      </w:tr>
+      <w:tr>
+        <w:trPr>
+          <w:trHeight w:val="360"/>
+          <w:tblCellSpacing w:w="15" w:type="dxa"/>
+        </w:trPr>
+        <w:tc>
+          <w:tcPr>
+            <w:tcW w:w="1065" w:type="pct"/>
+            <w:tcBorders>
+              <w:top w:val="single" w:sz="6" w:space="0" w:color="C4C7C5"/>
+              <w:left w:val="single" w:sz="6" w:space="0" w:color="C4C7C5"/>
+              <w:bottom w:val="single" w:sz="6" w:space="0" w:color="C4C7C5"/>
+              <w:right w:val="single" w:sz="6" w:space="0" w:color="C4C7C5"/>
+            </w:tcBorders>
+            <w:tcMar>
+              <w:top w:w="120" w:type="dxa"/>
+              <w:left w:w="180" w:type="dxa"/>
+              <w:bottom w:w="120" w:type="dxa"/>
+              <w:right w:w="180" w:type="dxa"/>
+            </w:tcMar>
+            <w:vAlign w:val="center"/>
+            <w:hideMark/>
+          </w:tcPr>
+          <w:p>
+            <w:r>
+              <w:t>Random Forest</w:t>
+            </w:r>
+          </w:p>
+        </w:tc>
+        <w:tc>
+          <w:tcPr>
+            <w:tcW w:w="978" w:type="pct"/>
+            <w:tcBorders>
+              <w:top w:val="single" w:sz="6" w:space="0" w:color="C4C7C5"/>
+              <w:left w:val="single" w:sz="6" w:space="0" w:color="C4C7C5"/>
+              <w:bottom w:val="single" w:sz="6" w:space="0" w:color="C4C7C5"/>
+              <w:right w:val="single" w:sz="6" w:space="0" w:color="C4C7C5"/>
+            </w:tcBorders>
+            <w:tcMar>
+              <w:top w:w="120" w:type="dxa"/>
+              <w:left w:w="180" w:type="dxa"/>
+              <w:bottom w:w="120" w:type="dxa"/>
+              <w:right w:w="180" w:type="dxa"/>
+            </w:tcMar>
+            <w:vAlign w:val="center"/>
+            <w:hideMark/>
+          </w:tcPr>
+          <w:p>
+            <w:r>
+              <w:t>0.891</w:t>
+            </w:r>
+          </w:p>
+        </w:tc>
+        <w:tc>
+          <w:tcPr>
+            <w:tcW w:w="719" w:type="pct"/>
+            <w:tcBorders>
+              <w:top w:val="single" w:sz="6" w:space="0" w:color="C4C7C5"/>
+              <w:left w:val="single" w:sz="6" w:space="0" w:color="C4C7C5"/>
+              <w:bottom w:val="single" w:sz="6" w:space="0" w:color="C4C7C5"/>
+              <w:right w:val="single" w:sz="6" w:space="0" w:color="C4C7C5"/>
+            </w:tcBorders>
+            <w:tcMar>
+              <w:top w:w="120" w:type="dxa"/>
+              <w:left w:w="180" w:type="dxa"/>
+              <w:bottom w:w="120" w:type="dxa"/>
+              <w:right w:w="180" w:type="dxa"/>
+            </w:tcMar>
+            <w:vAlign w:val="center"/>
+            <w:hideMark/>
+          </w:tcPr>
+          <w:p>
+            <w:r>
+              <w:t>0.868</w:t>
+            </w:r>
+          </w:p>
+        </w:tc>
+        <w:tc>
+          <w:tcPr>
+            <w:tcW w:w="737" w:type="pct"/>
+            <w:tcBorders>
+              <w:top w:val="single" w:sz="6" w:space="0" w:color="C4C7C5"/>
+              <w:left w:val="single" w:sz="6" w:space="0" w:color="C4C7C5"/>
+              <w:bottom w:val="single" w:sz="6" w:space="0" w:color="C4C7C5"/>
+              <w:right w:val="single" w:sz="6" w:space="0" w:color="C4C7C5"/>
+            </w:tcBorders>
+            <w:tcMar>
+              <w:top w:w="120" w:type="dxa"/>
+              <w:left w:w="180" w:type="dxa"/>
+              <w:bottom w:w="120" w:type="dxa"/>
+              <w:right w:w="180" w:type="dxa"/>
+            </w:tcMar>
+            <w:vAlign w:val="center"/>
+            <w:hideMark/>
+          </w:tcPr>
+          <w:p>
+            <w:r>
+              <w:t>0.900</w:t>
+            </w:r>
+          </w:p>
+        </w:tc>
+        <w:tc>
+          <w:tcPr>
+            <w:tcW w:w="552" w:type="pct"/>
+            <w:tcBorders>
+              <w:top w:val="single" w:sz="6" w:space="0" w:color="C4C7C5"/>
+              <w:left w:val="single" w:sz="6" w:space="0" w:color="C4C7C5"/>
+              <w:bottom w:val="single" w:sz="6" w:space="0" w:color="C4C7C5"/>
+              <w:right w:val="single" w:sz="6" w:space="0" w:color="C4C7C5"/>
+            </w:tcBorders>
+            <w:tcMar>
+              <w:top w:w="120" w:type="dxa"/>
+              <w:left w:w="180" w:type="dxa"/>
+              <w:bottom w:w="120" w:type="dxa"/>
+              <w:right w:w="180" w:type="dxa"/>
+            </w:tcMar>
+            <w:vAlign w:val="center"/>
+            <w:hideMark/>
+          </w:tcPr>
+          <w:p>
+            <w:r>
+              <w:t>0.843</w:t>
+            </w:r>
+          </w:p>
+        </w:tc>
+        <w:tc>
+          <w:tcPr>
+            <w:tcW w:w="817" w:type="pct"/>
+            <w:tcBorders>
+              <w:top w:val="single" w:sz="6" w:space="0" w:color="C4C7C5"/>
+              <w:left w:val="single" w:sz="6" w:space="0" w:color="C4C7C5"/>
+              <w:bottom w:val="single" w:sz="6" w:space="0" w:color="C4C7C5"/>
+              <w:right w:val="single" w:sz="6" w:space="0" w:color="C4C7C5"/>
+            </w:tcBorders>
+            <w:tcMar>
+              <w:top w:w="120" w:type="dxa"/>
+              <w:left w:w="180" w:type="dxa"/>
+              <w:bottom w:w="120" w:type="dxa"/>
+              <w:right w:w="180" w:type="dxa"/>
+            </w:tcMar>
+            <w:vAlign w:val="center"/>
+            <w:hideMark/>
+          </w:tcPr>
+          <w:p>
+            <w:r>
+              <w:t>0.947</w:t>
+            </w:r>
+          </w:p>
+        </w:tc>
+      </w:tr>
+    </w:tbl>
     <w:p>
       <w:pPr>
         <w:rPr>
@@ -690,10 +1223,155 @@
         <w:t xml:space="preserve"> </w:t>
       </w:r>
       <w:r>
-        <w:t>Both models underwent systematic hyperparameter tuning using GridSearchCV with 5-fold cross-validation. For the Random Forest classifier, grid search evaluated n_estimators [50, 100] and max_depth [None, 10]. The optimal parameters converged on n_estimators=100 and max_depth=None (mirroring the baseline configuration), while tuning the C parameter for Logistic Regression. The optimal hyperparameters were automatically tracked in MLflow. Ultimately, the tuned Random Forest model was selected for production because its ensemble architecture captured the complex, non-linear relationships in the clinical health data more effectively. Demonstrating superior performance across Accuracy, Precision, Recall, and ROC-AUC metrics, it was serialized as model.pkl for deployment.</w:t>
+        <w:t xml:space="preserve">Both models underwent systematic hyperparameter tuning using GridSearchCV with 5-fold cross-validation. For the Random Forest classifier, grid search evaluated n_estimators [50, 100] and max_depth [None, 10], converging on n_estimators=100 and max_depth=None. For Logistic Regression, tuning the inverse regularization strength converged on C=1.0. Ultimately, the tuned Random Forest model was selected for production. While Logistic Regression achieved a slightly higher CV ROC-AUC (0.908) and Recall (0.875), Random Forest was chosen for its superior generalization on the unseen test set, evidenced by its higher Test ROC-AUC (0.947), Accuracy (0.868), and Precision (0.900). The entire pipeline—including the StandardScaler </w:t>
       </w:r>
       <w:r>
-        <w:br w:type="page"/>
+        <w:lastRenderedPageBreak/>
+        <w:t>and OneHotEncoder preprocessing steps alongside the chosen classifier—was serialized together as model.pkl to ensure full reproducibility. Additionally, all environment dependencies and exact versions were strictly pinned in requirements.txt.</w:t>
+      </w:r>
+    </w:p>
+    <w:p>
+      <w:r>
+        <w:t>F</w:t>
+      </w:r>
+      <w:r>
+        <w:t>igure 6: MLflow Artifacts UI displaying the logged Confusion Matrix for the selected model.</w:t>
+      </w:r>
+    </w:p>
+    <w:p>
+      <w:pPr>
+        <w:rPr>
+          <w:b/>
+          <w:bCs/>
+        </w:rPr>
+      </w:pPr>
+      <w:r>
+        <w:rPr>
+          <w:noProof/>
+        </w:rPr>
+        <w:drawing>
+          <wp:inline distT="0" distB="0" distL="0" distR="0" wp14:anchorId="1562D3F2" wp14:editId="381E67D4">
+            <wp:extent cx="4308821" cy="2766060"/>
+            <wp:effectExtent l="0" t="0" r="0" b="0"/>
+            <wp:docPr id="2124023325" name="Picture 10"/>
+            <wp:cNvGraphicFramePr>
+              <a:graphicFrameLocks xmlns:a="http://schemas.openxmlformats.org/drawingml/2006/main" noChangeAspect="1"/>
+            </wp:cNvGraphicFramePr>
+            <a:graphic xmlns:a="http://schemas.openxmlformats.org/drawingml/2006/main">
+              <a:graphicData uri="http://schemas.openxmlformats.org/drawingml/2006/picture">
+                <pic:pic xmlns:pic="http://schemas.openxmlformats.org/drawingml/2006/picture">
+                  <pic:nvPicPr>
+                    <pic:cNvPr id="0" name="Picture 13"/>
+                    <pic:cNvPicPr>
+                      <a:picLocks noChangeAspect="1" noChangeArrowheads="1"/>
+                    </pic:cNvPicPr>
+                  </pic:nvPicPr>
+                  <pic:blipFill>
+                    <a:blip r:embed="rId18">
+                      <a:extLst>
+                        <a:ext uri="{28A0092B-C50C-407E-A947-70E740481C1C}">
+                          <a14:useLocalDpi xmlns:a14="http://schemas.microsoft.com/office/drawing/2010/main" val="0"/>
+                        </a:ext>
+                      </a:extLst>
+                    </a:blip>
+                    <a:srcRect/>
+                    <a:stretch>
+                      <a:fillRect/>
+                    </a:stretch>
+                  </pic:blipFill>
+                  <pic:spPr bwMode="auto">
+                    <a:xfrm>
+                      <a:off x="0" y="0"/>
+                      <a:ext cx="4328848" cy="2778916"/>
+                    </a:xfrm>
+                    <a:prstGeom prst="rect">
+                      <a:avLst/>
+                    </a:prstGeom>
+                    <a:noFill/>
+                    <a:ln>
+                      <a:noFill/>
+                    </a:ln>
+                  </pic:spPr>
+                </pic:pic>
+              </a:graphicData>
+            </a:graphic>
+          </wp:inline>
+        </w:drawing>
+      </w:r>
+    </w:p>
+    <w:p>
+      <w:r>
+        <w:t>Figure 7: MLflow Artifacts UI displaying the logged ROC Curve evaluation plot.</w:t>
+      </w:r>
+    </w:p>
+    <w:p>
+      <w:pPr>
+        <w:pStyle w:val="Heading1"/>
+      </w:pPr>
+      <w:r>
+        <w:rPr>
+          <w:noProof/>
+        </w:rPr>
+        <w:drawing>
+          <wp:inline distT="0" distB="0" distL="0" distR="0" wp14:anchorId="7066978C" wp14:editId="52CBA564">
+            <wp:extent cx="4236720" cy="2862237"/>
+            <wp:effectExtent l="0" t="0" r="0" b="0"/>
+            <wp:docPr id="1448759504" name="Picture 11"/>
+            <wp:cNvGraphicFramePr>
+              <a:graphicFrameLocks xmlns:a="http://schemas.openxmlformats.org/drawingml/2006/main" noChangeAspect="1"/>
+            </wp:cNvGraphicFramePr>
+            <a:graphic xmlns:a="http://schemas.openxmlformats.org/drawingml/2006/main">
+              <a:graphicData uri="http://schemas.openxmlformats.org/drawingml/2006/picture">
+                <pic:pic xmlns:pic="http://schemas.openxmlformats.org/drawingml/2006/picture">
+                  <pic:nvPicPr>
+                    <pic:cNvPr id="0" name="Picture 15"/>
+                    <pic:cNvPicPr>
+                      <a:picLocks noChangeAspect="1" noChangeArrowheads="1"/>
+                    </pic:cNvPicPr>
+                  </pic:nvPicPr>
+                  <pic:blipFill>
+                    <a:blip r:embed="rId19">
+                      <a:extLst>
+                        <a:ext uri="{28A0092B-C50C-407E-A947-70E740481C1C}">
+                          <a14:useLocalDpi xmlns:a14="http://schemas.microsoft.com/office/drawing/2010/main" val="0"/>
+                        </a:ext>
+                      </a:extLst>
+                    </a:blip>
+                    <a:srcRect/>
+                    <a:stretch>
+                      <a:fillRect/>
+                    </a:stretch>
+                  </pic:blipFill>
+                  <pic:spPr bwMode="auto">
+                    <a:xfrm>
+                      <a:off x="0" y="0"/>
+                      <a:ext cx="4247629" cy="2869607"/>
+                    </a:xfrm>
+                    <a:prstGeom prst="rect">
+                      <a:avLst/>
+                    </a:prstGeom>
+                    <a:noFill/>
+                    <a:ln>
+                      <a:noFill/>
+                    </a:ln>
+                  </pic:spPr>
+                </pic:pic>
+              </a:graphicData>
+            </a:graphic>
+          </wp:inline>
+        </w:drawing>
+      </w:r>
+    </w:p>
+    <w:p/>
+    <w:p>
+      <w:pPr>
+        <w:rPr>
+          <w:b/>
+          <w:bCs/>
+        </w:rPr>
+      </w:pPr>
+      <w:r>
+        <w:t>Additionally, visual evaluation plots including the Confusion Matrix and ROC Curve were automatically generated and logged as run artifacts in MLflow to enable comprehensive performance analysis.</w:t>
       </w:r>
     </w:p>
     <w:p>
@@ -707,7 +1385,10 @@
     </w:p>
     <w:p>
       <w:r>
-        <w:t>To ensure the reliability of the trained model, unit tests were implemented using pytest. The tests verified the existence of the model artifact and validated its predictive capability on sample data.</w:t>
+        <w:t>To ensure the reliability of the trained model, unit tests were implemented using pytest. The comprehensive test suite verified model existence, binary prediction constraints, data loading, and API payload validation. A Continuous Integration (CI) pipeline was established using GitHub Actions (ci.yml). This workflow automatically provisions an Ubuntu server, installs dependencies, executes flake8 linting, runs the pytest suite, executes model training, and packages the trained model.pkl as an automated deployment artifact upon every push to the main branch</w:t>
+      </w:r>
+      <w:r>
+        <w:t>.</w:t>
       </w:r>
     </w:p>
     <w:p>
@@ -719,7 +1400,29 @@
       </w:r>
     </w:p>
     <w:p>
+      <w:pPr>
+        <w:pStyle w:val="ListBullet"/>
+        <w:numPr>
+          <w:ilvl w:val="0"/>
+          <w:numId w:val="0"/>
+        </w:numPr>
+        <w:ind w:left="360"/>
+      </w:pPr>
       <w:r>
+        <w:t xml:space="preserve">Figure </w:t>
+      </w:r>
+      <w:r>
+        <w:t>8</w:t>
+      </w:r>
+      <w:r>
+        <w:t>: Local Pytest execution showing all tests passing</w:t>
+      </w:r>
+    </w:p>
+    <w:p>
+      <w:r>
+        <w:rPr>
+          <w:noProof/>
+        </w:rPr>
         <w:drawing>
           <wp:inline distT="0" distB="0" distL="0" distR="0" wp14:anchorId="3D169CE9" wp14:editId="24B0CB5C">
             <wp:extent cx="5486400" cy="992505"/>
@@ -736,7 +1439,7 @@
                     <pic:cNvPicPr/>
                   </pic:nvPicPr>
                   <pic:blipFill>
-                    <a:blip r:embed="rId18"/>
+                    <a:blip r:embed="rId20"/>
                     <a:stretch>
                       <a:fillRect/>
                     </a:stretch>
@@ -768,22 +1471,52 @@
     <w:p>
       <w:pPr>
         <w:pStyle w:val="ListBullet"/>
+        <w:numPr>
+          <w:ilvl w:val="0"/>
+          <w:numId w:val="0"/>
+        </w:numPr>
+        <w:ind w:left="360"/>
+      </w:pPr>
+    </w:p>
+    <w:p>
+      <w:pPr>
+        <w:pStyle w:val="ListBullet"/>
       </w:pPr>
       <w:r>
         <w:t>GitHub Actions Status:</w:t>
       </w:r>
     </w:p>
-    <w:p/>
+    <w:p>
+      <w:pPr>
+        <w:pStyle w:val="ListBullet"/>
+        <w:numPr>
+          <w:ilvl w:val="0"/>
+          <w:numId w:val="0"/>
+        </w:numPr>
+      </w:pPr>
+      <w:r>
+        <w:t xml:space="preserve">        </w:t>
+      </w:r>
+      <w:r>
+        <w:t xml:space="preserve">Figure </w:t>
+      </w:r>
+      <w:r>
+        <w:t>9</w:t>
+      </w:r>
+      <w:r>
+        <w:t>: GitHub Actions CI/CD pipeline successful run</w:t>
+      </w:r>
+    </w:p>
     <w:p>
       <w:r>
         <w:rPr>
           <w:noProof/>
         </w:rPr>
         <w:drawing>
-          <wp:inline distT="0" distB="0" distL="0" distR="0" wp14:anchorId="1D4CAB3A" wp14:editId="7341E07E">
-            <wp:extent cx="5486400" cy="2467610"/>
-            <wp:effectExtent l="0" t="0" r="0" b="8890"/>
-            <wp:docPr id="1137462003" name="Picture 4"/>
+          <wp:inline distT="0" distB="0" distL="0" distR="0" wp14:anchorId="325816F7" wp14:editId="0B4BA693">
+            <wp:extent cx="4018134" cy="1920240"/>
+            <wp:effectExtent l="0" t="0" r="1905" b="3810"/>
+            <wp:docPr id="412564701" name="Picture 1"/>
             <wp:cNvGraphicFramePr>
               <a:graphicFrameLocks xmlns:a="http://schemas.openxmlformats.org/drawingml/2006/main" noChangeAspect="1"/>
             </wp:cNvGraphicFramePr>
@@ -791,36 +1524,23 @@
               <a:graphicData uri="http://schemas.openxmlformats.org/drawingml/2006/picture">
                 <pic:pic xmlns:pic="http://schemas.openxmlformats.org/drawingml/2006/picture">
                   <pic:nvPicPr>
-                    <pic:cNvPr id="0" name="Picture 1"/>
-                    <pic:cNvPicPr>
-                      <a:picLocks noChangeAspect="1" noChangeArrowheads="1"/>
-                    </pic:cNvPicPr>
+                    <pic:cNvPr id="412564701" name=""/>
+                    <pic:cNvPicPr/>
                   </pic:nvPicPr>
                   <pic:blipFill>
-                    <a:blip r:embed="rId19">
-                      <a:extLst>
-                        <a:ext uri="{28A0092B-C50C-407E-A947-70E740481C1C}">
-                          <a14:useLocalDpi xmlns:a14="http://schemas.microsoft.com/office/drawing/2010/main" val="0"/>
-                        </a:ext>
-                      </a:extLst>
-                    </a:blip>
-                    <a:srcRect/>
+                    <a:blip r:embed="rId21"/>
                     <a:stretch>
                       <a:fillRect/>
                     </a:stretch>
                   </pic:blipFill>
-                  <pic:spPr bwMode="auto">
+                  <pic:spPr>
                     <a:xfrm>
                       <a:off x="0" y="0"/>
-                      <a:ext cx="5486400" cy="2467610"/>
+                      <a:ext cx="4020477" cy="1921360"/>
                     </a:xfrm>
                     <a:prstGeom prst="rect">
                       <a:avLst/>
                     </a:prstGeom>
-                    <a:noFill/>
-                    <a:ln>
-                      <a:noFill/>
-                    </a:ln>
                   </pic:spPr>
                 </pic:pic>
               </a:graphicData>
@@ -856,7 +1576,17 @@
         <w:t>FastAPI Swagger UI Testing:</w:t>
       </w:r>
     </w:p>
-    <w:p/>
+    <w:p>
+      <w:r>
+        <w:t xml:space="preserve">Figure </w:t>
+      </w:r>
+      <w:r>
+        <w:t>10</w:t>
+      </w:r>
+      <w:r>
+        <w:t>: FastAPI Swagger UI demonstrating a successful prediction response</w:t>
+      </w:r>
+    </w:p>
     <w:p>
       <w:r>
         <w:rPr>
@@ -880,7 +1610,7 @@
                     </pic:cNvPicPr>
                   </pic:nvPicPr>
                   <pic:blipFill>
-                    <a:blip r:embed="rId20">
+                    <a:blip r:embed="rId22">
                       <a:extLst>
                         <a:ext uri="{28A0092B-C50C-407E-A947-70E740481C1C}">
                           <a14:useLocalDpi xmlns:a14="http://schemas.microsoft.com/office/drawing/2010/main" val="0"/>
@@ -913,16 +1643,10 @@
       </w:r>
     </w:p>
     <w:p>
-      <w:r>
-        <w:br w:type="page"/>
-      </w:r>
-    </w:p>
-    <w:p>
       <w:pPr>
         <w:pStyle w:val="Heading1"/>
       </w:pPr>
       <w:r>
-        <w:lastRenderedPageBreak/>
         <w:t>6. Containerization</w:t>
       </w:r>
     </w:p>
@@ -932,24 +1656,20 @@
       </w:r>
     </w:p>
     <w:p>
-      <w:pPr>
-        <w:pStyle w:val="ListBullet"/>
-      </w:pPr>
       <w:r>
-        <w:t>Docker Container Running:</w:t>
+        <w:t>Figure 11: Docker build execution demonstrating successful containerization of the API and dependencies.</w:t>
       </w:r>
     </w:p>
-    <w:p/>
     <w:p>
       <w:r>
         <w:rPr>
           <w:noProof/>
         </w:rPr>
         <w:drawing>
-          <wp:inline distT="0" distB="0" distL="0" distR="0" wp14:anchorId="4C24B353" wp14:editId="3ED57C2F">
-            <wp:extent cx="2819400" cy="857250"/>
+          <wp:inline distT="0" distB="0" distL="0" distR="0" wp14:anchorId="28BD9B7E" wp14:editId="1EE5BE93">
+            <wp:extent cx="5486400" cy="1646555"/>
             <wp:effectExtent l="0" t="0" r="0" b="0"/>
-            <wp:docPr id="531410373" name="Picture 10"/>
+            <wp:docPr id="479093987" name="Picture 2"/>
             <wp:cNvGraphicFramePr>
               <a:graphicFrameLocks xmlns:a="http://schemas.openxmlformats.org/drawingml/2006/main" noChangeAspect="1"/>
             </wp:cNvGraphicFramePr>
@@ -957,13 +1677,13 @@
               <a:graphicData uri="http://schemas.openxmlformats.org/drawingml/2006/picture">
                 <pic:pic xmlns:pic="http://schemas.openxmlformats.org/drawingml/2006/picture">
                   <pic:nvPicPr>
-                    <pic:cNvPr id="0" name="Picture 22"/>
+                    <pic:cNvPr id="0" name="Picture 3"/>
                     <pic:cNvPicPr>
                       <a:picLocks noChangeAspect="1" noChangeArrowheads="1"/>
                     </pic:cNvPicPr>
                   </pic:nvPicPr>
                   <pic:blipFill>
-                    <a:blip r:embed="rId21">
+                    <a:blip r:embed="rId23">
                       <a:extLst>
                         <a:ext uri="{28A0092B-C50C-407E-A947-70E740481C1C}">
                           <a14:useLocalDpi xmlns:a14="http://schemas.microsoft.com/office/drawing/2010/main" val="0"/>
@@ -978,7 +1698,67 @@
                   <pic:spPr bwMode="auto">
                     <a:xfrm>
                       <a:off x="0" y="0"/>
-                      <a:ext cx="2819400" cy="857250"/>
+                      <a:ext cx="5486400" cy="1646555"/>
+                    </a:xfrm>
+                    <a:prstGeom prst="rect">
+                      <a:avLst/>
+                    </a:prstGeom>
+                    <a:noFill/>
+                    <a:ln>
+                      <a:noFill/>
+                    </a:ln>
+                  </pic:spPr>
+                </pic:pic>
+              </a:graphicData>
+            </a:graphic>
+          </wp:inline>
+        </w:drawing>
+      </w:r>
+    </w:p>
+    <w:p>
+      <w:r>
+        <w:t xml:space="preserve">Figure 12: Live prediction executed against the running Docker container via curl, displaying the JSON input payload and calculated probability. </w:t>
+      </w:r>
+    </w:p>
+    <w:p>
+      <w:r>
+        <w:rPr>
+          <w:noProof/>
+        </w:rPr>
+        <w:drawing>
+          <wp:inline distT="0" distB="0" distL="0" distR="0" wp14:anchorId="06020AAA" wp14:editId="3AF05969">
+            <wp:extent cx="5486400" cy="377190"/>
+            <wp:effectExtent l="0" t="0" r="0" b="3810"/>
+            <wp:docPr id="206238501" name="Picture 1"/>
+            <wp:cNvGraphicFramePr>
+              <a:graphicFrameLocks xmlns:a="http://schemas.openxmlformats.org/drawingml/2006/main" noChangeAspect="1"/>
+            </wp:cNvGraphicFramePr>
+            <a:graphic xmlns:a="http://schemas.openxmlformats.org/drawingml/2006/main">
+              <a:graphicData uri="http://schemas.openxmlformats.org/drawingml/2006/picture">
+                <pic:pic xmlns:pic="http://schemas.openxmlformats.org/drawingml/2006/picture">
+                  <pic:nvPicPr>
+                    <pic:cNvPr id="0" name="Picture 1"/>
+                    <pic:cNvPicPr>
+                      <a:picLocks noChangeAspect="1" noChangeArrowheads="1"/>
+                    </pic:cNvPicPr>
+                  </pic:nvPicPr>
+                  <pic:blipFill>
+                    <a:blip r:embed="rId24">
+                      <a:extLst>
+                        <a:ext uri="{28A0092B-C50C-407E-A947-70E740481C1C}">
+                          <a14:useLocalDpi xmlns:a14="http://schemas.microsoft.com/office/drawing/2010/main" val="0"/>
+                        </a:ext>
+                      </a:extLst>
+                    </a:blip>
+                    <a:srcRect/>
+                    <a:stretch>
+                      <a:fillRect/>
+                    </a:stretch>
+                  </pic:blipFill>
+                  <pic:spPr bwMode="auto">
+                    <a:xfrm>
+                      <a:off x="0" y="0"/>
+                      <a:ext cx="5486400" cy="377190"/>
                     </a:xfrm>
                     <a:prstGeom prst="rect">
                       <a:avLst/>
@@ -1031,7 +1811,22 @@
     </w:p>
     <w:p>
       <w:r>
-        <w:t>To satisfy production monitoring requirements, the FastAPI application was instrumented using the prometheus-fastapi-instrumentator library. This automatically tracks API request counts, latency, and response status codes, exposing them via a dedicated /metrics endpoint for Prometheus scraping.</w:t>
+        <w:t xml:space="preserve">To satisfy production monitoring requirements, the FastAPI application was instrumented using the prometheus-fastapi-instrumentator library. This automatically tracks API request </w:t>
+      </w:r>
+      <w:r>
+        <w:lastRenderedPageBreak/>
+        <w:t>counts, latency, and response status codes, exposing them via a dedicated /metrics endpoint for Prometheus scraping.</w:t>
+      </w:r>
+    </w:p>
+    <w:p>
+      <w:r>
+        <w:t>Figure 1</w:t>
+      </w:r>
+      <w:r>
+        <w:t>3</w:t>
+      </w:r>
+      <w:r>
+        <w:t>: Prometheus metrics exposed at the /metrics endpoint</w:t>
       </w:r>
     </w:p>
     <w:p>
@@ -1039,7 +1834,6 @@
         <w:rPr>
           <w:noProof/>
         </w:rPr>
-        <w:lastRenderedPageBreak/>
         <w:drawing>
           <wp:inline distT="0" distB="0" distL="0" distR="0" wp14:anchorId="20F94737" wp14:editId="59DAB3BD">
             <wp:extent cx="5486400" cy="6071870"/>
@@ -1058,7 +1852,7 @@
                     </pic:cNvPicPr>
                   </pic:nvPicPr>
                   <pic:blipFill>
-                    <a:blip r:embed="rId22">
+                    <a:blip r:embed="rId25">
                       <a:extLst>
                         <a:ext uri="{28A0092B-C50C-407E-A947-70E740481C1C}">
                           <a14:useLocalDpi xmlns:a14="http://schemas.microsoft.com/office/drawing/2010/main" val="0"/>
@@ -1095,54 +1889,30 @@
         <w:t>The /metrics endpoint dynamically exposes standard Prometheus-compatible metrics, including http_requests_total which accurately logs incoming /predict API traffic.</w:t>
       </w:r>
     </w:p>
+    <w:p/>
+    <w:p/>
     <w:p>
       <w:r>
-        <w:rPr>
-          <w:rFonts w:asciiTheme="majorHAnsi" w:eastAsiaTheme="majorEastAsia" w:hAnsiTheme="majorHAnsi" w:cstheme="majorBidi"/>
-          <w:b/>
-          <w:bCs/>
-          <w:color w:val="365F91" w:themeColor="accent1" w:themeShade="BF"/>
-          <w:sz w:val="28"/>
-          <w:szCs w:val="28"/>
-        </w:rPr>
-        <w:t>8</w:t>
+        <w:lastRenderedPageBreak/>
+        <w:t>Figure 1</w:t>
       </w:r>
       <w:r>
-        <w:rPr>
-          <w:rFonts w:asciiTheme="majorHAnsi" w:eastAsiaTheme="majorEastAsia" w:hAnsiTheme="majorHAnsi" w:cstheme="majorBidi"/>
-          <w:b/>
-          <w:bCs/>
-          <w:color w:val="365F91" w:themeColor="accent1" w:themeShade="BF"/>
-          <w:sz w:val="28"/>
-          <w:szCs w:val="28"/>
-        </w:rPr>
-        <w:t>. Production Deployment (Kubernetes)</w:t>
+        <w:t>4</w:t>
       </w:r>
       <w:r>
-        <w:t xml:space="preserve"> </w:t>
+        <w:t>: Prometheus UI dashboard successfully querying the scraped http_requests_total metric from the active /metrics endpoint.</w:t>
       </w:r>
     </w:p>
     <w:p>
       <w:r>
-        <w:t>To ensure high availability and scalability, the Dockerized API was deployed to a local Kubernetes cluster using a deployment manifest (k8s-manifest.yaml). The application was exposed to external traffic using a LoadBalancer service, fulfilling production-readiness requirements for cloud deployment.</w:t>
-      </w:r>
-    </w:p>
-    <w:p>
-      <w:pPr>
         <w:rPr>
           <w:noProof/>
         </w:rPr>
-      </w:pPr>
-      <w:r>
-        <w:rPr>
-          <w:noProof/>
-        </w:rPr>
-        <w:lastRenderedPageBreak/>
         <w:drawing>
-          <wp:inline distT="0" distB="0" distL="0" distR="0" wp14:anchorId="5194F0AF" wp14:editId="6E428C09">
-            <wp:extent cx="5486400" cy="710565"/>
+          <wp:inline distT="0" distB="0" distL="0" distR="0" wp14:anchorId="74A6661F" wp14:editId="011B7E8C">
+            <wp:extent cx="5486400" cy="1315720"/>
             <wp:effectExtent l="0" t="0" r="0" b="0"/>
-            <wp:docPr id="1579098043" name="Picture 6"/>
+            <wp:docPr id="2039639563" name="Picture 12"/>
             <wp:cNvGraphicFramePr>
               <a:graphicFrameLocks xmlns:a="http://schemas.openxmlformats.org/drawingml/2006/main" noChangeAspect="1"/>
             </wp:cNvGraphicFramePr>
@@ -1150,13 +1920,13 @@
               <a:graphicData uri="http://schemas.openxmlformats.org/drawingml/2006/picture">
                 <pic:pic xmlns:pic="http://schemas.openxmlformats.org/drawingml/2006/picture">
                   <pic:nvPicPr>
-                    <pic:cNvPr id="0" name="Picture 5"/>
+                    <pic:cNvPr id="0" name="Picture 17"/>
                     <pic:cNvPicPr>
                       <a:picLocks noChangeAspect="1" noChangeArrowheads="1"/>
                     </pic:cNvPicPr>
                   </pic:nvPicPr>
                   <pic:blipFill>
-                    <a:blip r:embed="rId23">
+                    <a:blip r:embed="rId26">
                       <a:extLst>
                         <a:ext uri="{28A0092B-C50C-407E-A947-70E740481C1C}">
                           <a14:useLocalDpi xmlns:a14="http://schemas.microsoft.com/office/drawing/2010/main" val="0"/>
@@ -1171,7 +1941,99 @@
                   <pic:spPr bwMode="auto">
                     <a:xfrm>
                       <a:off x="0" y="0"/>
-                      <a:ext cx="5486400" cy="710565"/>
+                      <a:ext cx="5486400" cy="1315720"/>
+                    </a:xfrm>
+                    <a:prstGeom prst="rect">
+                      <a:avLst/>
+                    </a:prstGeom>
+                    <a:noFill/>
+                    <a:ln>
+                      <a:noFill/>
+                    </a:ln>
+                  </pic:spPr>
+                </pic:pic>
+              </a:graphicData>
+            </a:graphic>
+          </wp:inline>
+        </w:drawing>
+      </w:r>
+    </w:p>
+    <w:p>
+      <w:r>
+        <w:rPr>
+          <w:rFonts w:asciiTheme="majorHAnsi" w:eastAsiaTheme="majorEastAsia" w:hAnsiTheme="majorHAnsi" w:cstheme="majorBidi"/>
+          <w:b/>
+          <w:bCs/>
+          <w:color w:val="365F91" w:themeColor="accent1" w:themeShade="BF"/>
+          <w:sz w:val="28"/>
+          <w:szCs w:val="28"/>
+        </w:rPr>
+        <w:t>8. Production Deployment (Kubernetes)</w:t>
+      </w:r>
+      <w:r>
+        <w:t xml:space="preserve"> </w:t>
+      </w:r>
+    </w:p>
+    <w:p>
+      <w:r>
+        <w:t>To ensure high availability and scalability, the Dockerized API was deployed to a local Kubernetes cluster using a deployment manifest (k8s-manifest.yaml). The application was exposed to external traffic using a LoadBalancer service, fulfilling production-readiness requirements for cloud deployment.</w:t>
+      </w:r>
+    </w:p>
+    <w:p>
+      <w:r>
+        <w:t>Figure 1</w:t>
+      </w:r>
+      <w:r>
+        <w:t>5</w:t>
+      </w:r>
+      <w:r>
+        <w:t>: Kubernetes deployment status and corresponding pod logs confirming successful live traffic routing and metrics exposure.</w:t>
+      </w:r>
+    </w:p>
+    <w:p>
+      <w:pPr>
+        <w:rPr>
+          <w:noProof/>
+        </w:rPr>
+      </w:pPr>
+      <w:r>
+        <w:rPr>
+          <w:noProof/>
+        </w:rPr>
+        <w:drawing>
+          <wp:inline distT="0" distB="0" distL="0" distR="0" wp14:anchorId="15C63E38" wp14:editId="4703D506">
+            <wp:extent cx="5486400" cy="1577975"/>
+            <wp:effectExtent l="0" t="0" r="0" b="3175"/>
+            <wp:docPr id="348760713" name="Picture 1"/>
+            <wp:cNvGraphicFramePr>
+              <a:graphicFrameLocks xmlns:a="http://schemas.openxmlformats.org/drawingml/2006/main" noChangeAspect="1"/>
+            </wp:cNvGraphicFramePr>
+            <a:graphic xmlns:a="http://schemas.openxmlformats.org/drawingml/2006/main">
+              <a:graphicData uri="http://schemas.openxmlformats.org/drawingml/2006/picture">
+                <pic:pic xmlns:pic="http://schemas.openxmlformats.org/drawingml/2006/picture">
+                  <pic:nvPicPr>
+                    <pic:cNvPr id="0" name="Picture 1"/>
+                    <pic:cNvPicPr>
+                      <a:picLocks noChangeAspect="1" noChangeArrowheads="1"/>
+                    </pic:cNvPicPr>
+                  </pic:nvPicPr>
+                  <pic:blipFill>
+                    <a:blip r:embed="rId27">
+                      <a:extLst>
+                        <a:ext uri="{28A0092B-C50C-407E-A947-70E740481C1C}">
+                          <a14:useLocalDpi xmlns:a14="http://schemas.microsoft.com/office/drawing/2010/main" val="0"/>
+                        </a:ext>
+                      </a:extLst>
+                    </a:blip>
+                    <a:srcRect/>
+                    <a:stretch>
+                      <a:fillRect/>
+                    </a:stretch>
+                  </pic:blipFill>
+                  <pic:spPr bwMode="auto">
+                    <a:xfrm>
+                      <a:off x="0" y="0"/>
+                      <a:ext cx="5486400" cy="1577975"/>
                     </a:xfrm>
                     <a:prstGeom prst="rect">
                       <a:avLst/>
@@ -1195,53 +2057,11 @@
       </w:r>
     </w:p>
     <w:p>
-      <w:r>
-        <w:drawing>
-          <wp:inline distT="0" distB="0" distL="0" distR="0" wp14:anchorId="4B23F02E" wp14:editId="4683D833">
-            <wp:extent cx="5486400" cy="2311400"/>
-            <wp:effectExtent l="0" t="0" r="0" b="0"/>
-            <wp:docPr id="710957450" name="Picture 1"/>
-            <wp:cNvGraphicFramePr>
-              <a:graphicFrameLocks xmlns:a="http://schemas.openxmlformats.org/drawingml/2006/main" noChangeAspect="1"/>
-            </wp:cNvGraphicFramePr>
-            <a:graphic xmlns:a="http://schemas.openxmlformats.org/drawingml/2006/main">
-              <a:graphicData uri="http://schemas.openxmlformats.org/drawingml/2006/picture">
-                <pic:pic xmlns:pic="http://schemas.openxmlformats.org/drawingml/2006/picture">
-                  <pic:nvPicPr>
-                    <pic:cNvPr id="710957450" name=""/>
-                    <pic:cNvPicPr/>
-                  </pic:nvPicPr>
-                  <pic:blipFill>
-                    <a:blip r:embed="rId24"/>
-                    <a:stretch>
-                      <a:fillRect/>
-                    </a:stretch>
-                  </pic:blipFill>
-                  <pic:spPr>
-                    <a:xfrm>
-                      <a:off x="0" y="0"/>
-                      <a:ext cx="5486400" cy="2311400"/>
-                    </a:xfrm>
-                    <a:prstGeom prst="rect">
-                      <a:avLst/>
-                    </a:prstGeom>
-                  </pic:spPr>
-                </pic:pic>
-              </a:graphicData>
-            </a:graphic>
-          </wp:inline>
-        </w:drawing>
-      </w:r>
-    </w:p>
-    <w:p>
       <w:pPr>
         <w:pStyle w:val="Heading1"/>
       </w:pPr>
       <w:r>
-        <w:t>9</w:t>
-      </w:r>
-      <w:r>
-        <w:t>. Conclusion</w:t>
+        <w:t>9. Conclusion</w:t>
       </w:r>
     </w:p>
     <w:p>
@@ -1973,7 +2793,7 @@
   <w:style w:type="paragraph" w:default="1" w:styleId="Normal">
     <w:name w:val="Normal"/>
     <w:qFormat/>
-    <w:rsid w:val="00FC693F"/>
+    <w:rsid w:val="00827970"/>
   </w:style>
   <w:style w:type="paragraph" w:styleId="Heading1">
     <w:name w:val="heading 1"/>
@@ -2187,6 +3007,7 @@
   <w:style w:type="character" w:default="1" w:styleId="DefaultParagraphFont">
     <w:name w:val="Default Paragraph Font"/>
     <w:uiPriority w:val="1"/>
+    <w:semiHidden/>
     <w:unhideWhenUsed/>
   </w:style>
   <w:style w:type="table" w:default="1" w:styleId="TableNormal">
@@ -14568,8 +15389,8 @@
       </dsp:nvSpPr>
       <dsp:spPr>
         <a:xfrm>
-          <a:off x="433896" y="610943"/>
-          <a:ext cx="273985" cy="72"/>
+          <a:off x="360374" y="241096"/>
+          <a:ext cx="227559" cy="72"/>
         </a:xfrm>
         <a:prstGeom prst="rect">
           <a:avLst/>
@@ -14617,8 +15438,8 @@
       </dsp:nvSpPr>
       <dsp:spPr>
         <a:xfrm>
-          <a:off x="684396" y="578975"/>
-          <a:ext cx="36009" cy="67701"/>
+          <a:off x="568429" y="214525"/>
+          <a:ext cx="29907" cy="56229"/>
         </a:xfrm>
         <a:prstGeom prst="chevron">
           <a:avLst>
@@ -14661,7 +15482,7 @@
         </a:fontRef>
       </dsp:style>
       <dsp:txBody>
-        <a:bodyPr spcFirstLastPara="0" vert="horz" wrap="square" lIns="12427" tIns="165100" rIns="12427" bIns="165100" numCol="1" spcCol="1270" anchor="t" anchorCtr="0">
+        <a:bodyPr spcFirstLastPara="0" vert="horz" wrap="square" lIns="10321" tIns="165100" rIns="10321" bIns="165100" numCol="1" spcCol="1270" anchor="t" anchorCtr="0">
           <a:noAutofit/>
         </a:bodyPr>
         <a:lstStyle/>
@@ -14685,8 +15506,8 @@
         </a:p>
       </dsp:txBody>
       <dsp:txXfrm>
-        <a:off x="63123" y="921690"/>
-        <a:ext cx="663263" cy="1733530"/>
+        <a:off x="52428" y="505449"/>
+        <a:ext cx="550876" cy="1740522"/>
       </dsp:txXfrm>
     </dsp:sp>
     <dsp:sp modelId="{10543DF3-8FD4-45D3-A974-5CCD4CF68976}">
@@ -14696,8 +15517,8 @@
       </dsp:nvSpPr>
       <dsp:spPr>
         <a:xfrm>
-          <a:off x="311745" y="527968"/>
-          <a:ext cx="166020" cy="166020"/>
+          <a:off x="267047" y="180313"/>
+          <a:ext cx="121637" cy="121637"/>
         </a:xfrm>
         <a:prstGeom prst="ellipse">
           <a:avLst/>
@@ -14738,7 +15559,7 @@
         </a:fontRef>
       </dsp:style>
       <dsp:txBody>
-        <a:bodyPr spcFirstLastPara="0" vert="horz" wrap="square" lIns="6443" tIns="6443" rIns="6443" bIns="6443" numCol="1" spcCol="1270" anchor="ctr" anchorCtr="0">
+        <a:bodyPr spcFirstLastPara="0" vert="horz" wrap="square" lIns="4720" tIns="4720" rIns="4720" bIns="4720" numCol="1" spcCol="1270" anchor="ctr" anchorCtr="0">
           <a:noAutofit/>
         </a:bodyPr>
         <a:lstStyle/>
@@ -14762,8 +15583,8 @@
         </a:p>
       </dsp:txBody>
       <dsp:txXfrm>
-        <a:off x="336058" y="552281"/>
-        <a:ext cx="117394" cy="117394"/>
+        <a:off x="284860" y="198126"/>
+        <a:ext cx="86011" cy="86011"/>
       </dsp:txXfrm>
     </dsp:sp>
     <dsp:sp modelId="{CCC50AB2-532E-4F91-9262-D6B4ADF8966B}">
@@ -14773,8 +15594,8 @@
       </dsp:nvSpPr>
       <dsp:spPr>
         <a:xfrm>
-          <a:off x="394719" y="765989"/>
-          <a:ext cx="72" cy="131641"/>
+          <a:off x="327830" y="373950"/>
+          <a:ext cx="72" cy="109335"/>
         </a:xfrm>
         <a:prstGeom prst="rect">
           <a:avLst/>
@@ -14824,8 +15645,8 @@
       </dsp:nvSpPr>
       <dsp:spPr>
         <a:xfrm>
-          <a:off x="42488" y="901055"/>
-          <a:ext cx="704533" cy="1774800"/>
+          <a:off x="35289" y="488310"/>
+          <a:ext cx="585154" cy="1774800"/>
         </a:xfrm>
         <a:prstGeom prst="roundRect">
           <a:avLst>
@@ -14867,7 +15688,7 @@
         <a:fontRef idx="minor"/>
       </dsp:style>
       <dsp:txBody>
-        <a:bodyPr spcFirstLastPara="0" vert="horz" wrap="square" lIns="12427" tIns="165100" rIns="12427" bIns="165100" numCol="1" spcCol="1270" anchor="t" anchorCtr="0">
+        <a:bodyPr spcFirstLastPara="0" vert="horz" wrap="square" lIns="10321" tIns="165100" rIns="10321" bIns="165100" numCol="1" spcCol="1270" anchor="t" anchorCtr="0">
           <a:noAutofit/>
         </a:bodyPr>
         <a:lstStyle/>
@@ -14891,8 +15712,8 @@
         </a:p>
       </dsp:txBody>
       <dsp:txXfrm>
-        <a:off x="63123" y="921690"/>
-        <a:ext cx="663263" cy="1733530"/>
+        <a:off x="52428" y="505449"/>
+        <a:ext cx="550876" cy="1740522"/>
       </dsp:txXfrm>
     </dsp:sp>
     <dsp:sp modelId="{23303305-B91F-4C34-947A-50DCFFBCBC5D}">
@@ -14902,8 +15723,8 @@
       </dsp:nvSpPr>
       <dsp:spPr>
         <a:xfrm>
-          <a:off x="786162" y="610943"/>
-          <a:ext cx="704533" cy="72"/>
+          <a:off x="652951" y="241096"/>
+          <a:ext cx="585154" cy="72"/>
         </a:xfrm>
         <a:prstGeom prst="rect">
           <a:avLst/>
@@ -14951,8 +15772,8 @@
       </dsp:nvSpPr>
       <dsp:spPr>
         <a:xfrm>
-          <a:off x="1467211" y="578975"/>
-          <a:ext cx="36009" cy="67701"/>
+          <a:off x="1218600" y="214525"/>
+          <a:ext cx="29907" cy="56229"/>
         </a:xfrm>
         <a:prstGeom prst="chevron">
           <a:avLst>
@@ -14995,7 +15816,7 @@
         </a:fontRef>
       </dsp:style>
       <dsp:txBody>
-        <a:bodyPr spcFirstLastPara="0" vert="horz" wrap="square" lIns="12427" tIns="165100" rIns="12427" bIns="165100" numCol="1" spcCol="1270" anchor="t" anchorCtr="0">
+        <a:bodyPr spcFirstLastPara="0" vert="horz" wrap="square" lIns="10321" tIns="165100" rIns="10321" bIns="165100" numCol="1" spcCol="1270" anchor="t" anchorCtr="0">
           <a:noAutofit/>
         </a:bodyPr>
         <a:lstStyle/>
@@ -15019,8 +15840,8 @@
         </a:p>
       </dsp:txBody>
       <dsp:txXfrm>
-        <a:off x="845938" y="921690"/>
-        <a:ext cx="663263" cy="1733530"/>
+        <a:off x="702599" y="505449"/>
+        <a:ext cx="550876" cy="1740522"/>
       </dsp:txXfrm>
     </dsp:sp>
     <dsp:sp modelId="{BCCCC2AE-BC31-48CB-820B-5803F0E650CF}">
@@ -15030,8 +15851,8 @@
       </dsp:nvSpPr>
       <dsp:spPr>
         <a:xfrm>
-          <a:off x="1094559" y="527968"/>
-          <a:ext cx="166020" cy="166020"/>
+          <a:off x="917218" y="180313"/>
+          <a:ext cx="121637" cy="121637"/>
         </a:xfrm>
         <a:prstGeom prst="ellipse">
           <a:avLst/>
@@ -15072,7 +15893,7 @@
         </a:fontRef>
       </dsp:style>
       <dsp:txBody>
-        <a:bodyPr spcFirstLastPara="0" vert="horz" wrap="square" lIns="6443" tIns="6443" rIns="6443" bIns="6443" numCol="1" spcCol="1270" anchor="ctr" anchorCtr="0">
+        <a:bodyPr spcFirstLastPara="0" vert="horz" wrap="square" lIns="4720" tIns="4720" rIns="4720" bIns="4720" numCol="1" spcCol="1270" anchor="ctr" anchorCtr="0">
           <a:noAutofit/>
         </a:bodyPr>
         <a:lstStyle/>
@@ -15096,8 +15917,8 @@
         </a:p>
       </dsp:txBody>
       <dsp:txXfrm>
-        <a:off x="1118872" y="552281"/>
-        <a:ext cx="117394" cy="117394"/>
+        <a:off x="935031" y="198126"/>
+        <a:ext cx="86011" cy="86011"/>
       </dsp:txXfrm>
     </dsp:sp>
     <dsp:sp modelId="{99CC9BEF-FD89-4B27-93F7-2E867E0D494F}">
@@ -15107,8 +15928,8 @@
       </dsp:nvSpPr>
       <dsp:spPr>
         <a:xfrm>
-          <a:off x="1177534" y="765989"/>
-          <a:ext cx="72" cy="131641"/>
+          <a:off x="978001" y="373950"/>
+          <a:ext cx="72" cy="109335"/>
         </a:xfrm>
         <a:prstGeom prst="rect">
           <a:avLst/>
@@ -15158,8 +15979,8 @@
       </dsp:nvSpPr>
       <dsp:spPr>
         <a:xfrm>
-          <a:off x="825303" y="901055"/>
-          <a:ext cx="704533" cy="1774800"/>
+          <a:off x="685460" y="488310"/>
+          <a:ext cx="585154" cy="1774800"/>
         </a:xfrm>
         <a:prstGeom prst="roundRect">
           <a:avLst>
@@ -15201,7 +16022,7 @@
         <a:fontRef idx="minor"/>
       </dsp:style>
       <dsp:txBody>
-        <a:bodyPr spcFirstLastPara="0" vert="horz" wrap="square" lIns="12427" tIns="165100" rIns="12427" bIns="165100" numCol="1" spcCol="1270" anchor="t" anchorCtr="0">
+        <a:bodyPr spcFirstLastPara="0" vert="horz" wrap="square" lIns="10321" tIns="165100" rIns="10321" bIns="165100" numCol="1" spcCol="1270" anchor="t" anchorCtr="0">
           <a:noAutofit/>
         </a:bodyPr>
         <a:lstStyle/>
@@ -15225,8 +16046,8 @@
         </a:p>
       </dsp:txBody>
       <dsp:txXfrm>
-        <a:off x="845938" y="921690"/>
-        <a:ext cx="663263" cy="1733530"/>
+        <a:off x="702599" y="505449"/>
+        <a:ext cx="550876" cy="1740522"/>
       </dsp:txXfrm>
     </dsp:sp>
     <dsp:sp modelId="{899A70CF-A234-4AE8-B1BC-3168A40968C8}">
@@ -15236,8 +16057,8 @@
       </dsp:nvSpPr>
       <dsp:spPr>
         <a:xfrm>
-          <a:off x="1568977" y="610746"/>
-          <a:ext cx="704533" cy="72"/>
+          <a:off x="1303123" y="240779"/>
+          <a:ext cx="585154" cy="72"/>
         </a:xfrm>
         <a:prstGeom prst="rect">
           <a:avLst/>
@@ -15285,8 +16106,8 @@
       </dsp:nvSpPr>
       <dsp:spPr>
         <a:xfrm>
-          <a:off x="2250026" y="578812"/>
-          <a:ext cx="36009" cy="67701"/>
+          <a:off x="1868772" y="214262"/>
+          <a:ext cx="29907" cy="56229"/>
         </a:xfrm>
         <a:prstGeom prst="chevron">
           <a:avLst>
@@ -15329,7 +16150,7 @@
         </a:fontRef>
       </dsp:style>
       <dsp:txBody>
-        <a:bodyPr spcFirstLastPara="0" vert="horz" wrap="square" lIns="12427" tIns="165100" rIns="12427" bIns="165100" numCol="1" spcCol="1270" anchor="t" anchorCtr="0">
+        <a:bodyPr spcFirstLastPara="0" vert="horz" wrap="square" lIns="10321" tIns="165100" rIns="10321" bIns="165100" numCol="1" spcCol="1270" anchor="t" anchorCtr="0">
           <a:noAutofit/>
         </a:bodyPr>
         <a:lstStyle/>
@@ -15353,8 +16174,8 @@
         </a:p>
       </dsp:txBody>
       <dsp:txXfrm>
-        <a:off x="1628753" y="921297"/>
-        <a:ext cx="663263" cy="1733530"/>
+        <a:off x="1352770" y="504815"/>
+        <a:ext cx="550876" cy="1740522"/>
       </dsp:txXfrm>
     </dsp:sp>
     <dsp:sp modelId="{1BB73B3A-4BC3-4339-9B9C-A814A5E70E42}">
@@ -15364,8 +16185,8 @@
       </dsp:nvSpPr>
       <dsp:spPr>
         <a:xfrm>
-          <a:off x="1877374" y="527772"/>
-          <a:ext cx="166020" cy="166020"/>
+          <a:off x="1567390" y="179996"/>
+          <a:ext cx="121637" cy="121637"/>
         </a:xfrm>
         <a:prstGeom prst="ellipse">
           <a:avLst/>
@@ -15406,7 +16227,7 @@
         </a:fontRef>
       </dsp:style>
       <dsp:txBody>
-        <a:bodyPr spcFirstLastPara="0" vert="horz" wrap="square" lIns="6443" tIns="6443" rIns="6443" bIns="6443" numCol="1" spcCol="1270" anchor="ctr" anchorCtr="0">
+        <a:bodyPr spcFirstLastPara="0" vert="horz" wrap="square" lIns="4720" tIns="4720" rIns="4720" bIns="4720" numCol="1" spcCol="1270" anchor="ctr" anchorCtr="0">
           <a:noAutofit/>
         </a:bodyPr>
         <a:lstStyle/>
@@ -15430,8 +16251,8 @@
         </a:p>
       </dsp:txBody>
       <dsp:txXfrm>
-        <a:off x="1901687" y="552085"/>
-        <a:ext cx="117394" cy="117394"/>
+        <a:off x="1585203" y="197809"/>
+        <a:ext cx="86011" cy="86011"/>
       </dsp:txXfrm>
     </dsp:sp>
     <dsp:sp modelId="{22A120AF-7852-4FDB-9F5A-A331983BC220}">
@@ -15441,8 +16262,8 @@
       </dsp:nvSpPr>
       <dsp:spPr>
         <a:xfrm>
-          <a:off x="1960349" y="765793"/>
-          <a:ext cx="72" cy="131641"/>
+          <a:off x="1628172" y="373634"/>
+          <a:ext cx="72" cy="109335"/>
         </a:xfrm>
         <a:prstGeom prst="rect">
           <a:avLst/>
@@ -15492,8 +16313,8 @@
       </dsp:nvSpPr>
       <dsp:spPr>
         <a:xfrm>
-          <a:off x="1608118" y="900662"/>
-          <a:ext cx="704533" cy="1774800"/>
+          <a:off x="1335631" y="487676"/>
+          <a:ext cx="585154" cy="1774800"/>
         </a:xfrm>
         <a:prstGeom prst="roundRect">
           <a:avLst>
@@ -15535,7 +16356,7 @@
         <a:fontRef idx="minor"/>
       </dsp:style>
       <dsp:txBody>
-        <a:bodyPr spcFirstLastPara="0" vert="horz" wrap="square" lIns="12427" tIns="165100" rIns="12427" bIns="165100" numCol="1" spcCol="1270" anchor="t" anchorCtr="0">
+        <a:bodyPr spcFirstLastPara="0" vert="horz" wrap="square" lIns="10321" tIns="165100" rIns="10321" bIns="165100" numCol="1" spcCol="1270" anchor="t" anchorCtr="0">
           <a:noAutofit/>
         </a:bodyPr>
         <a:lstStyle/>
@@ -15559,8 +16380,8 @@
         </a:p>
       </dsp:txBody>
       <dsp:txXfrm>
-        <a:off x="1628753" y="921297"/>
-        <a:ext cx="663263" cy="1733530"/>
+        <a:off x="1352770" y="504815"/>
+        <a:ext cx="550876" cy="1740522"/>
       </dsp:txXfrm>
     </dsp:sp>
     <dsp:sp modelId="{62DFB04D-B415-4110-9045-97E6D1617B73}">
@@ -15570,8 +16391,8 @@
       </dsp:nvSpPr>
       <dsp:spPr>
         <a:xfrm>
-          <a:off x="2351792" y="610746"/>
-          <a:ext cx="704533" cy="72"/>
+          <a:off x="1953294" y="240779"/>
+          <a:ext cx="585154" cy="72"/>
         </a:xfrm>
         <a:prstGeom prst="rect">
           <a:avLst/>
@@ -15619,8 +16440,8 @@
       </dsp:nvSpPr>
       <dsp:spPr>
         <a:xfrm>
-          <a:off x="3032841" y="578812"/>
-          <a:ext cx="36009" cy="67701"/>
+          <a:off x="2518943" y="214262"/>
+          <a:ext cx="29907" cy="56229"/>
         </a:xfrm>
         <a:prstGeom prst="chevron">
           <a:avLst>
@@ -15663,7 +16484,7 @@
         </a:fontRef>
       </dsp:style>
       <dsp:txBody>
-        <a:bodyPr spcFirstLastPara="0" vert="horz" wrap="square" lIns="12427" tIns="165100" rIns="12427" bIns="165100" numCol="1" spcCol="1270" anchor="t" anchorCtr="0">
+        <a:bodyPr spcFirstLastPara="0" vert="horz" wrap="square" lIns="10321" tIns="165100" rIns="10321" bIns="165100" numCol="1" spcCol="1270" anchor="t" anchorCtr="0">
           <a:noAutofit/>
         </a:bodyPr>
         <a:lstStyle/>
@@ -15687,8 +16508,8 @@
         </a:p>
       </dsp:txBody>
       <dsp:txXfrm>
-        <a:off x="2411568" y="921297"/>
-        <a:ext cx="663263" cy="1733530"/>
+        <a:off x="2002941" y="504815"/>
+        <a:ext cx="550876" cy="1740522"/>
       </dsp:txXfrm>
     </dsp:sp>
     <dsp:sp modelId="{C9003F74-885D-4AC7-9AD9-D3409D0E88D1}">
@@ -15698,8 +16519,8 @@
       </dsp:nvSpPr>
       <dsp:spPr>
         <a:xfrm>
-          <a:off x="2660189" y="527772"/>
-          <a:ext cx="166020" cy="166020"/>
+          <a:off x="2217561" y="179996"/>
+          <a:ext cx="121637" cy="121637"/>
         </a:xfrm>
         <a:prstGeom prst="ellipse">
           <a:avLst/>
@@ -15740,7 +16561,7 @@
         </a:fontRef>
       </dsp:style>
       <dsp:txBody>
-        <a:bodyPr spcFirstLastPara="0" vert="horz" wrap="square" lIns="6443" tIns="6443" rIns="6443" bIns="6443" numCol="1" spcCol="1270" anchor="ctr" anchorCtr="0">
+        <a:bodyPr spcFirstLastPara="0" vert="horz" wrap="square" lIns="4720" tIns="4720" rIns="4720" bIns="4720" numCol="1" spcCol="1270" anchor="ctr" anchorCtr="0">
           <a:noAutofit/>
         </a:bodyPr>
         <a:lstStyle/>
@@ -15764,8 +16585,8 @@
         </a:p>
       </dsp:txBody>
       <dsp:txXfrm>
-        <a:off x="2684502" y="552085"/>
-        <a:ext cx="117394" cy="117394"/>
+        <a:off x="2235374" y="197809"/>
+        <a:ext cx="86011" cy="86011"/>
       </dsp:txXfrm>
     </dsp:sp>
     <dsp:sp modelId="{65DD3CD6-05E9-4EBF-BDEF-BCA0C0F3C0ED}">
@@ -15775,8 +16596,8 @@
       </dsp:nvSpPr>
       <dsp:spPr>
         <a:xfrm>
-          <a:off x="2743164" y="765793"/>
-          <a:ext cx="72" cy="131641"/>
+          <a:off x="2278344" y="373634"/>
+          <a:ext cx="72" cy="109335"/>
         </a:xfrm>
         <a:prstGeom prst="rect">
           <a:avLst/>
@@ -15826,8 +16647,8 @@
       </dsp:nvSpPr>
       <dsp:spPr>
         <a:xfrm>
-          <a:off x="2390933" y="900662"/>
-          <a:ext cx="704533" cy="1774800"/>
+          <a:off x="1985802" y="487676"/>
+          <a:ext cx="585154" cy="1774800"/>
         </a:xfrm>
         <a:prstGeom prst="roundRect">
           <a:avLst>
@@ -15869,7 +16690,7 @@
         <a:fontRef idx="minor"/>
       </dsp:style>
       <dsp:txBody>
-        <a:bodyPr spcFirstLastPara="0" vert="horz" wrap="square" lIns="12427" tIns="165100" rIns="12427" bIns="165100" numCol="1" spcCol="1270" anchor="t" anchorCtr="0">
+        <a:bodyPr spcFirstLastPara="0" vert="horz" wrap="square" lIns="10321" tIns="165100" rIns="10321" bIns="165100" numCol="1" spcCol="1270" anchor="t" anchorCtr="0">
           <a:noAutofit/>
         </a:bodyPr>
         <a:lstStyle/>
@@ -15893,8 +16714,8 @@
         </a:p>
       </dsp:txBody>
       <dsp:txXfrm>
-        <a:off x="2411568" y="921297"/>
-        <a:ext cx="663263" cy="1733530"/>
+        <a:off x="2002941" y="504815"/>
+        <a:ext cx="550876" cy="1740522"/>
       </dsp:txXfrm>
     </dsp:sp>
     <dsp:sp modelId="{C1D26974-4F7B-4693-8F29-703A3EC38E6C}">
@@ -15904,8 +16725,8 @@
       </dsp:nvSpPr>
       <dsp:spPr>
         <a:xfrm>
-          <a:off x="3134607" y="610746"/>
-          <a:ext cx="704533" cy="72"/>
+          <a:off x="2603465" y="240779"/>
+          <a:ext cx="585154" cy="72"/>
         </a:xfrm>
         <a:prstGeom prst="rect">
           <a:avLst/>
@@ -15953,8 +16774,8 @@
       </dsp:nvSpPr>
       <dsp:spPr>
         <a:xfrm>
-          <a:off x="3815656" y="578812"/>
-          <a:ext cx="36009" cy="67701"/>
+          <a:off x="3169114" y="214262"/>
+          <a:ext cx="29907" cy="56229"/>
         </a:xfrm>
         <a:prstGeom prst="chevron">
           <a:avLst>
@@ -15997,7 +16818,7 @@
         </a:fontRef>
       </dsp:style>
       <dsp:txBody>
-        <a:bodyPr spcFirstLastPara="0" vert="horz" wrap="square" lIns="12427" tIns="165100" rIns="12427" bIns="165100" numCol="1" spcCol="1270" anchor="t" anchorCtr="0">
+        <a:bodyPr spcFirstLastPara="0" vert="horz" wrap="square" lIns="10321" tIns="165100" rIns="10321" bIns="165100" numCol="1" spcCol="1270" anchor="t" anchorCtr="0">
           <a:noAutofit/>
         </a:bodyPr>
         <a:lstStyle/>
@@ -16021,8 +16842,8 @@
         </a:p>
       </dsp:txBody>
       <dsp:txXfrm>
-        <a:off x="3194383" y="921297"/>
-        <a:ext cx="663263" cy="1733530"/>
+        <a:off x="2653113" y="504815"/>
+        <a:ext cx="550876" cy="1740522"/>
       </dsp:txXfrm>
     </dsp:sp>
     <dsp:sp modelId="{B28475ED-7184-4B90-A663-A67D2C4C1751}">
@@ -16032,8 +16853,8 @@
       </dsp:nvSpPr>
       <dsp:spPr>
         <a:xfrm>
-          <a:off x="3443004" y="527772"/>
-          <a:ext cx="166020" cy="166020"/>
+          <a:off x="2867732" y="179996"/>
+          <a:ext cx="121637" cy="121637"/>
         </a:xfrm>
         <a:prstGeom prst="ellipse">
           <a:avLst/>
@@ -16074,7 +16895,7 @@
         </a:fontRef>
       </dsp:style>
       <dsp:txBody>
-        <a:bodyPr spcFirstLastPara="0" vert="horz" wrap="square" lIns="6443" tIns="6443" rIns="6443" bIns="6443" numCol="1" spcCol="1270" anchor="ctr" anchorCtr="0">
+        <a:bodyPr spcFirstLastPara="0" vert="horz" wrap="square" lIns="4720" tIns="4720" rIns="4720" bIns="4720" numCol="1" spcCol="1270" anchor="ctr" anchorCtr="0">
           <a:noAutofit/>
         </a:bodyPr>
         <a:lstStyle/>
@@ -16098,8 +16919,8 @@
         </a:p>
       </dsp:txBody>
       <dsp:txXfrm>
-        <a:off x="3467317" y="552085"/>
-        <a:ext cx="117394" cy="117394"/>
+        <a:off x="2885545" y="197809"/>
+        <a:ext cx="86011" cy="86011"/>
       </dsp:txXfrm>
     </dsp:sp>
     <dsp:sp modelId="{986E3642-31F3-4C4A-8EC9-9908E0248ACC}">
@@ -16109,8 +16930,8 @@
       </dsp:nvSpPr>
       <dsp:spPr>
         <a:xfrm>
-          <a:off x="3525978" y="765793"/>
-          <a:ext cx="72" cy="131641"/>
+          <a:off x="2928515" y="373634"/>
+          <a:ext cx="72" cy="109335"/>
         </a:xfrm>
         <a:prstGeom prst="rect">
           <a:avLst/>
@@ -16160,8 +16981,8 @@
       </dsp:nvSpPr>
       <dsp:spPr>
         <a:xfrm>
-          <a:off x="3173748" y="900662"/>
-          <a:ext cx="704533" cy="1774800"/>
+          <a:off x="2635974" y="487676"/>
+          <a:ext cx="585154" cy="1774800"/>
         </a:xfrm>
         <a:prstGeom prst="roundRect">
           <a:avLst>
@@ -16203,7 +17024,7 @@
         <a:fontRef idx="minor"/>
       </dsp:style>
       <dsp:txBody>
-        <a:bodyPr spcFirstLastPara="0" vert="horz" wrap="square" lIns="12427" tIns="165100" rIns="12427" bIns="165100" numCol="1" spcCol="1270" anchor="t" anchorCtr="0">
+        <a:bodyPr spcFirstLastPara="0" vert="horz" wrap="square" lIns="10321" tIns="165100" rIns="10321" bIns="165100" numCol="1" spcCol="1270" anchor="t" anchorCtr="0">
           <a:noAutofit/>
         </a:bodyPr>
         <a:lstStyle/>
@@ -16227,8 +17048,8 @@
         </a:p>
       </dsp:txBody>
       <dsp:txXfrm>
-        <a:off x="3194383" y="921297"/>
-        <a:ext cx="663263" cy="1733530"/>
+        <a:off x="2653113" y="504815"/>
+        <a:ext cx="550876" cy="1740522"/>
       </dsp:txXfrm>
     </dsp:sp>
     <dsp:sp modelId="{B9A092BC-473B-4998-8095-A200C0F84E43}">
@@ -16238,8 +17059,8 @@
       </dsp:nvSpPr>
       <dsp:spPr>
         <a:xfrm>
-          <a:off x="3917422" y="610746"/>
-          <a:ext cx="704533" cy="72"/>
+          <a:off x="3253636" y="240779"/>
+          <a:ext cx="585154" cy="72"/>
         </a:xfrm>
         <a:prstGeom prst="rect">
           <a:avLst/>
@@ -16287,8 +17108,8 @@
       </dsp:nvSpPr>
       <dsp:spPr>
         <a:xfrm>
-          <a:off x="4598471" y="578812"/>
-          <a:ext cx="36009" cy="67701"/>
+          <a:off x="3819285" y="214262"/>
+          <a:ext cx="29907" cy="56229"/>
         </a:xfrm>
         <a:prstGeom prst="chevron">
           <a:avLst>
@@ -16331,7 +17152,7 @@
         </a:fontRef>
       </dsp:style>
       <dsp:txBody>
-        <a:bodyPr spcFirstLastPara="0" vert="horz" wrap="square" lIns="12427" tIns="165100" rIns="12427" bIns="165100" numCol="1" spcCol="1270" anchor="t" anchorCtr="0">
+        <a:bodyPr spcFirstLastPara="0" vert="horz" wrap="square" lIns="10321" tIns="165100" rIns="10321" bIns="165100" numCol="1" spcCol="1270" anchor="t" anchorCtr="0">
           <a:noAutofit/>
         </a:bodyPr>
         <a:lstStyle/>
@@ -16355,8 +17176,8 @@
         </a:p>
       </dsp:txBody>
       <dsp:txXfrm>
-        <a:off x="3977198" y="921297"/>
-        <a:ext cx="663263" cy="1733530"/>
+        <a:off x="3303284" y="504815"/>
+        <a:ext cx="550876" cy="1740522"/>
       </dsp:txXfrm>
     </dsp:sp>
     <dsp:sp modelId="{FF0C578E-6431-4F0D-AF9B-883A49FA7F96}">
@@ -16366,8 +17187,8 @@
       </dsp:nvSpPr>
       <dsp:spPr>
         <a:xfrm>
-          <a:off x="4225819" y="527772"/>
-          <a:ext cx="166020" cy="166020"/>
+          <a:off x="3517903" y="179996"/>
+          <a:ext cx="121637" cy="121637"/>
         </a:xfrm>
         <a:prstGeom prst="ellipse">
           <a:avLst/>
@@ -16408,7 +17229,7 @@
         </a:fontRef>
       </dsp:style>
       <dsp:txBody>
-        <a:bodyPr spcFirstLastPara="0" vert="horz" wrap="square" lIns="6443" tIns="6443" rIns="6443" bIns="6443" numCol="1" spcCol="1270" anchor="ctr" anchorCtr="0">
+        <a:bodyPr spcFirstLastPara="0" vert="horz" wrap="square" lIns="4720" tIns="4720" rIns="4720" bIns="4720" numCol="1" spcCol="1270" anchor="ctr" anchorCtr="0">
           <a:noAutofit/>
         </a:bodyPr>
         <a:lstStyle/>
@@ -16432,8 +17253,8 @@
         </a:p>
       </dsp:txBody>
       <dsp:txXfrm>
-        <a:off x="4250132" y="552085"/>
-        <a:ext cx="117394" cy="117394"/>
+        <a:off x="3535716" y="197809"/>
+        <a:ext cx="86011" cy="86011"/>
       </dsp:txXfrm>
     </dsp:sp>
     <dsp:sp modelId="{0B59B436-696F-42C0-9C1D-2F34C9AF31C5}">
@@ -16443,8 +17264,8 @@
       </dsp:nvSpPr>
       <dsp:spPr>
         <a:xfrm>
-          <a:off x="4308793" y="765793"/>
-          <a:ext cx="72" cy="131641"/>
+          <a:off x="3578686" y="373634"/>
+          <a:ext cx="72" cy="109335"/>
         </a:xfrm>
         <a:prstGeom prst="rect">
           <a:avLst/>
@@ -16494,8 +17315,8 @@
       </dsp:nvSpPr>
       <dsp:spPr>
         <a:xfrm>
-          <a:off x="3956563" y="900662"/>
-          <a:ext cx="704533" cy="1774800"/>
+          <a:off x="3286145" y="487676"/>
+          <a:ext cx="585154" cy="1774800"/>
         </a:xfrm>
         <a:prstGeom prst="roundRect">
           <a:avLst>
@@ -16537,7 +17358,7 @@
         <a:fontRef idx="minor"/>
       </dsp:style>
       <dsp:txBody>
-        <a:bodyPr spcFirstLastPara="0" vert="horz" wrap="square" lIns="12427" tIns="165100" rIns="12427" bIns="165100" numCol="1" spcCol="1270" anchor="t" anchorCtr="0">
+        <a:bodyPr spcFirstLastPara="0" vert="horz" wrap="square" lIns="10321" tIns="165100" rIns="10321" bIns="165100" numCol="1" spcCol="1270" anchor="t" anchorCtr="0">
           <a:noAutofit/>
         </a:bodyPr>
         <a:lstStyle/>
@@ -16561,8 +17382,8 @@
         </a:p>
       </dsp:txBody>
       <dsp:txXfrm>
-        <a:off x="3977198" y="921297"/>
-        <a:ext cx="663263" cy="1733530"/>
+        <a:off x="3303284" y="504815"/>
+        <a:ext cx="550876" cy="1740522"/>
       </dsp:txXfrm>
     </dsp:sp>
     <dsp:sp modelId="{4E781AAB-5DBF-4E20-83F9-8C03A66589D3}">
@@ -16572,8 +17393,8 @@
       </dsp:nvSpPr>
       <dsp:spPr>
         <a:xfrm>
-          <a:off x="4700237" y="612979"/>
-          <a:ext cx="391407" cy="70"/>
+          <a:off x="3903808" y="244633"/>
+          <a:ext cx="325085" cy="68"/>
         </a:xfrm>
         <a:prstGeom prst="rect">
           <a:avLst/>
@@ -16621,8 +17442,8 @@
       </dsp:nvSpPr>
       <dsp:spPr>
         <a:xfrm>
-          <a:off x="5008547" y="530004"/>
-          <a:ext cx="166020" cy="166020"/>
+          <a:off x="4167951" y="183849"/>
+          <a:ext cx="121637" cy="121637"/>
         </a:xfrm>
         <a:prstGeom prst="ellipse">
           <a:avLst/>
@@ -16663,7 +17484,7 @@
         </a:fontRef>
       </dsp:style>
       <dsp:txBody>
-        <a:bodyPr spcFirstLastPara="0" vert="horz" wrap="square" lIns="6449" tIns="6449" rIns="6449" bIns="6449" numCol="1" spcCol="1270" anchor="ctr" anchorCtr="0">
+        <a:bodyPr spcFirstLastPara="0" vert="horz" wrap="square" lIns="4730" tIns="4730" rIns="4730" bIns="4730" numCol="1" spcCol="1270" anchor="ctr" anchorCtr="0">
           <a:noAutofit/>
         </a:bodyPr>
         <a:lstStyle/>
@@ -16687,8 +17508,8 @@
         </a:p>
       </dsp:txBody>
       <dsp:txXfrm>
-        <a:off x="5032860" y="554317"/>
-        <a:ext cx="117394" cy="117394"/>
+        <a:off x="4185764" y="201662"/>
+        <a:ext cx="86011" cy="86011"/>
       </dsp:txXfrm>
     </dsp:sp>
     <dsp:sp modelId="{79D4E1C6-FC5E-45FF-9E99-E54405768664}">
@@ -16698,8 +17519,8 @@
       </dsp:nvSpPr>
       <dsp:spPr>
         <a:xfrm>
-          <a:off x="5091608" y="766446"/>
-          <a:ext cx="72" cy="128755"/>
+          <a:off x="4228857" y="374427"/>
+          <a:ext cx="72" cy="104689"/>
         </a:xfrm>
         <a:prstGeom prst="rect">
           <a:avLst/>
@@ -16749,8 +17570,8 @@
       </dsp:nvSpPr>
       <dsp:spPr>
         <a:xfrm>
-          <a:off x="4739377" y="900662"/>
-          <a:ext cx="704533" cy="1774800"/>
+          <a:off x="3936316" y="487676"/>
+          <a:ext cx="585154" cy="1774800"/>
         </a:xfrm>
         <a:prstGeom prst="roundRect">
           <a:avLst>
@@ -16792,7 +17613,7 @@
         <a:fontRef idx="minor"/>
       </dsp:style>
       <dsp:txBody>
-        <a:bodyPr spcFirstLastPara="0" vert="horz" wrap="square" lIns="12427" tIns="165100" rIns="12427" bIns="165100" numCol="1" spcCol="1270" anchor="t" anchorCtr="0">
+        <a:bodyPr spcFirstLastPara="0" vert="horz" wrap="square" lIns="10321" tIns="165100" rIns="10321" bIns="165100" numCol="1" spcCol="1270" anchor="t" anchorCtr="0">
           <a:noAutofit/>
         </a:bodyPr>
         <a:lstStyle/>
@@ -16816,8 +17637,8 @@
         </a:p>
       </dsp:txBody>
       <dsp:txXfrm>
-        <a:off x="4760012" y="921297"/>
-        <a:ext cx="663263" cy="1733530"/>
+        <a:off x="3953455" y="504815"/>
+        <a:ext cx="550876" cy="1740522"/>
       </dsp:txXfrm>
     </dsp:sp>
   </dsp:spTree>

</xml_diff>

<commit_message>
Add final report and video demonstration
</commit_message>
<xml_diff>
--- a/AIMLCZG523_Final_Report.docx
+++ b/AIMLCZG523_Final_Report.docx
@@ -7,8 +7,13 @@
         <w:pStyle w:val="Title"/>
         <w:jc w:val="center"/>
       </w:pPr>
+      <w:proofErr w:type="spellStart"/>
       <w:r>
-        <w:t>MLOps Pipeline for Heart Disease Prediction</w:t>
+        <w:t>MLOps</w:t>
+      </w:r>
+      <w:proofErr w:type="spellEnd"/>
+      <w:r>
+        <w:t xml:space="preserve"> Pipeline for Heart Disease Prediction</w:t>
       </w:r>
     </w:p>
     <w:p>
@@ -21,7 +26,15 @@
     </w:p>
     <w:p>
       <w:r>
-        <w:t xml:space="preserve">This project builds an end-to-end MLOps pipeline for the UCI Heart Disease dataset. The objective is to develop a binary classification model that predicts the presence or absence of heart disease based on patient clinical features. </w:t>
+        <w:t xml:space="preserve">This project builds an end-to-end </w:t>
+      </w:r>
+      <w:proofErr w:type="spellStart"/>
+      <w:r>
+        <w:t>MLOps</w:t>
+      </w:r>
+      <w:proofErr w:type="spellEnd"/>
+      <w:r>
+        <w:t xml:space="preserve"> pipeline for the UCI Heart Disease dataset. The objective is to develop a binary classification model that predicts the presence or absence of heart disease based on patient clinical features. </w:t>
       </w:r>
       <w:r>
         <w:rPr>
@@ -56,12 +69,12 @@
       <w:r>
         <w:t xml:space="preserve"> </w:t>
       </w:r>
-      <w:hyperlink r:id="rId7" w:tgtFrame="_blank" w:history="1">
+      <w:hyperlink r:id="rId7" w:history="1">
         <w:r>
           <w:rPr>
             <w:rStyle w:val="Hyperlink"/>
           </w:rPr>
-          <w:t>https://github.com/ssathishhkumarr/AIMLCZG523_Heart_Disease_Pipeline_2025AE05311/blob/main/demonstration.mp4</w:t>
+          <w:t>https://drive.google.com/file/d/1mvkLkXLtIEvC_TjLRqr940o8CsD-HKqs/view?usp=drive_link</w:t>
         </w:r>
       </w:hyperlink>
     </w:p>
@@ -100,7 +113,10 @@
         <w:rPr>
           <w:lang w:val="en-IN"/>
         </w:rPr>
-        <w:t>Clone the repository: git clone [https://github.com/ssathishhkumarr/AIMLCZG523_Heart_Disease_Pipeline_2025AE05311](https://github.com/ssathishhkumarr/AIMLCZG523_Heart_Disease_Pipeline_2025AE05311)</w:t>
+        <w:t xml:space="preserve">Clone the repository: </w:t>
+      </w:r>
+      <w:r>
+        <w:t>git clone https://github.com/ssathishhkumarr/AIMLCZG523_Heart_Disease_Pipeline_2025AE05311</w:t>
       </w:r>
     </w:p>
     <w:p>
@@ -134,7 +150,63 @@
         <w:rPr>
           <w:lang w:val="en-IN"/>
         </w:rPr>
-        <w:t>Create and activate a virtual environment: python -m venv venv followed by source venv/bin/activate (Linux/Mac) or venv\Scripts\activate (Windows).</w:t>
+        <w:t xml:space="preserve">Create and activate a virtual environment: python -m </w:t>
+      </w:r>
+      <w:proofErr w:type="spellStart"/>
+      <w:r>
+        <w:rPr>
+          <w:lang w:val="en-IN"/>
+        </w:rPr>
+        <w:t>venv</w:t>
+      </w:r>
+      <w:proofErr w:type="spellEnd"/>
+      <w:r>
+        <w:rPr>
+          <w:lang w:val="en-IN"/>
+        </w:rPr>
+        <w:t xml:space="preserve"> </w:t>
+      </w:r>
+      <w:proofErr w:type="spellStart"/>
+      <w:r>
+        <w:rPr>
+          <w:lang w:val="en-IN"/>
+        </w:rPr>
+        <w:t>venv</w:t>
+      </w:r>
+      <w:proofErr w:type="spellEnd"/>
+      <w:r>
+        <w:rPr>
+          <w:lang w:val="en-IN"/>
+        </w:rPr>
+        <w:t xml:space="preserve"> followed by source </w:t>
+      </w:r>
+      <w:proofErr w:type="spellStart"/>
+      <w:r>
+        <w:rPr>
+          <w:lang w:val="en-IN"/>
+        </w:rPr>
+        <w:t>venv</w:t>
+      </w:r>
+      <w:proofErr w:type="spellEnd"/>
+      <w:r>
+        <w:rPr>
+          <w:lang w:val="en-IN"/>
+        </w:rPr>
+        <w:t xml:space="preserve">/bin/activate (Linux/Mac) or </w:t>
+      </w:r>
+      <w:proofErr w:type="spellStart"/>
+      <w:r>
+        <w:rPr>
+          <w:lang w:val="en-IN"/>
+        </w:rPr>
+        <w:t>venv</w:t>
+      </w:r>
+      <w:proofErr w:type="spellEnd"/>
+      <w:r>
+        <w:rPr>
+          <w:lang w:val="en-IN"/>
+        </w:rPr>
+        <w:t>\Scripts\activate (Windows).</w:t>
       </w:r>
     </w:p>
     <w:p>
@@ -168,7 +240,21 @@
         <w:rPr>
           <w:lang w:val="en-IN"/>
         </w:rPr>
-        <w:t>Run unit tests to verify: pytest tests/</w:t>
+        <w:t xml:space="preserve">Run unit tests to verify: </w:t>
+      </w:r>
+      <w:proofErr w:type="spellStart"/>
+      <w:r>
+        <w:rPr>
+          <w:lang w:val="en-IN"/>
+        </w:rPr>
+        <w:t>pytest</w:t>
+      </w:r>
+      <w:proofErr w:type="spellEnd"/>
+      <w:r>
+        <w:rPr>
+          <w:lang w:val="en-IN"/>
+        </w:rPr>
+        <w:t xml:space="preserve"> tests/</w:t>
       </w:r>
     </w:p>
     <w:p>
@@ -225,7 +311,6 @@
           <w:b/>
           <w:bCs/>
         </w:rPr>
-        <w:lastRenderedPageBreak/>
         <w:t>Pipeline Architecture Diagram:</w:t>
       </w:r>
     </w:p>
@@ -234,6 +319,7 @@
         <w:rPr>
           <w:noProof/>
         </w:rPr>
+        <w:lastRenderedPageBreak/>
         <w:drawing>
           <wp:inline distT="0" distB="0" distL="0" distR="0" wp14:anchorId="02CDE8D0" wp14:editId="19137354">
             <wp:extent cx="4556760" cy="2438400"/>
@@ -339,12 +425,12 @@
         <w:pStyle w:val="ListBullet"/>
       </w:pPr>
       <w:r>
-        <w:lastRenderedPageBreak/>
         <w:t>Feature Distributions (Histograms):</w:t>
       </w:r>
     </w:p>
     <w:p>
       <w:r>
+        <w:lastRenderedPageBreak/>
         <w:t>Figure 2: Histograms showing the distribution of key numerical features</w:t>
       </w:r>
     </w:p>
@@ -490,20 +576,49 @@
     </w:p>
     <w:p>
       <w:r>
-        <w:t>A comprehensive preprocessing pipeline was constructed using Scikit-learn. Numerical features were scaled using StandardScaler, and categorical features were one-hot encoded. Two models, Logistic Regression and Random Forest, were trained and evaluated. MLflow was integrated to systematically track experiments, log model parameters, and record evaluation metrics (Accuracy, Precision, Recall, and ROC-AUC).</w:t>
+        <w:t xml:space="preserve">A comprehensive preprocessing pipeline was constructed using Scikit-learn. Numerical features were scaled using </w:t>
+      </w:r>
+      <w:proofErr w:type="spellStart"/>
+      <w:r>
+        <w:t>StandardScaler</w:t>
+      </w:r>
+      <w:proofErr w:type="spellEnd"/>
+      <w:r>
+        <w:t xml:space="preserve">, and categorical features were one-hot encoded. Two models, Logistic Regression and Random Forest, were trained and evaluated. </w:t>
+      </w:r>
+      <w:proofErr w:type="spellStart"/>
+      <w:r>
+        <w:t>MLflow</w:t>
+      </w:r>
+      <w:proofErr w:type="spellEnd"/>
+      <w:r>
+        <w:t xml:space="preserve"> was integrated to systematically track experiments, log model parameters, and record evaluation metrics (Accuracy, Precision, Recall, and ROC-AUC).</w:t>
       </w:r>
     </w:p>
     <w:p>
       <w:pPr>
         <w:pStyle w:val="ListBullet"/>
       </w:pPr>
+      <w:proofErr w:type="spellStart"/>
       <w:r>
-        <w:t>MLflow Tracking - Random Forest:</w:t>
+        <w:t>MLflow</w:t>
+      </w:r>
+      <w:proofErr w:type="spellEnd"/>
+      <w:r>
+        <w:t xml:space="preserve"> Tracking - Random Forest:</w:t>
       </w:r>
     </w:p>
     <w:p>
       <w:r>
-        <w:t>Figure 4: MLflow tracking UI displaying the Random Forest model run metrics and parameters</w:t>
+        <w:t xml:space="preserve">Figure 4: </w:t>
+      </w:r>
+      <w:proofErr w:type="spellStart"/>
+      <w:r>
+        <w:t>MLflow</w:t>
+      </w:r>
+      <w:proofErr w:type="spellEnd"/>
+      <w:r>
+        <w:t xml:space="preserve"> tracking UI displaying the Random Forest model run metrics and parameters</w:t>
       </w:r>
     </w:p>
     <w:p>
@@ -573,14 +688,27 @@
       <w:pPr>
         <w:pStyle w:val="ListBullet"/>
       </w:pPr>
+      <w:proofErr w:type="spellStart"/>
       <w:r>
         <w:lastRenderedPageBreak/>
-        <w:t>MLflow Tracking - Logistic Regression:</w:t>
+        <w:t>MLflow</w:t>
+      </w:r>
+      <w:proofErr w:type="spellEnd"/>
+      <w:r>
+        <w:t xml:space="preserve"> Tracking - Logistic Regression:</w:t>
       </w:r>
     </w:p>
     <w:p>
       <w:r>
-        <w:t>Figure 5: MLflow tracking UI for the Logistic Regression model run</w:t>
+        <w:t xml:space="preserve">Figure 5: </w:t>
+      </w:r>
+      <w:proofErr w:type="spellStart"/>
+      <w:r>
+        <w:t>MLflow</w:t>
+      </w:r>
+      <w:proofErr w:type="spellEnd"/>
+      <w:r>
+        <w:t xml:space="preserve"> tracking UI for the Logistic Regression model run</w:t>
       </w:r>
     </w:p>
     <w:p>
@@ -1223,11 +1351,75 @@
         <w:t xml:space="preserve"> </w:t>
       </w:r>
       <w:r>
-        <w:t xml:space="preserve">Both models underwent systematic hyperparameter tuning using GridSearchCV with 5-fold cross-validation. For the Random Forest classifier, grid search evaluated n_estimators [50, 100] and max_depth [None, 10], converging on n_estimators=100 and max_depth=None. For Logistic Regression, tuning the inverse regularization strength converged on C=1.0. Ultimately, the tuned Random Forest model was selected for production. While Logistic Regression achieved a slightly higher CV ROC-AUC (0.908) and Recall (0.875), Random Forest was chosen for its superior generalization on the unseen test set, evidenced by its higher Test ROC-AUC (0.947), Accuracy (0.868), and Precision (0.900). The entire pipeline—including the StandardScaler </w:t>
+        <w:t xml:space="preserve">Both models underwent systematic hyperparameter tuning using </w:t>
+      </w:r>
+      <w:proofErr w:type="spellStart"/>
+      <w:r>
+        <w:t>GridSearchCV</w:t>
+      </w:r>
+      <w:proofErr w:type="spellEnd"/>
+      <w:r>
+        <w:t xml:space="preserve"> with 5-fold cross-validation. For the Random Forest classifier, grid search evaluated </w:t>
+      </w:r>
+      <w:proofErr w:type="spellStart"/>
+      <w:r>
+        <w:t>n_estimators</w:t>
+      </w:r>
+      <w:proofErr w:type="spellEnd"/>
+      <w:r>
+        <w:t xml:space="preserve"> [50, 100] and </w:t>
+      </w:r>
+      <w:proofErr w:type="spellStart"/>
+      <w:r>
+        <w:t>max_depth</w:t>
+      </w:r>
+      <w:proofErr w:type="spellEnd"/>
+      <w:r>
+        <w:t xml:space="preserve"> [None, 10], converging on </w:t>
+      </w:r>
+      <w:proofErr w:type="spellStart"/>
+      <w:r>
+        <w:t>n_estimators</w:t>
+      </w:r>
+      <w:proofErr w:type="spellEnd"/>
+      <w:r>
+        <w:t xml:space="preserve">=100 and </w:t>
+      </w:r>
+      <w:proofErr w:type="spellStart"/>
+      <w:r>
+        <w:t>max_depth</w:t>
+      </w:r>
+      <w:proofErr w:type="spellEnd"/>
+      <w:r>
+        <w:t xml:space="preserve">=None. For Logistic Regression, tuning the inverse regularization strength converged on C=1.0. Ultimately, the tuned Random Forest model was selected for production. While Logistic Regression achieved a slightly higher CV ROC-AUC (0.908) and Recall (0.875), Random Forest was chosen for its superior generalization on the unseen test set, evidenced by its higher Test ROC-AUC (0.947), Accuracy (0.868), and Precision (0.900). The entire pipeline—including the </w:t>
+      </w:r>
+      <w:proofErr w:type="spellStart"/>
+      <w:r>
+        <w:t>StandardScaler</w:t>
+      </w:r>
+      <w:proofErr w:type="spellEnd"/>
+      <w:r>
+        <w:t xml:space="preserve"> </w:t>
       </w:r>
       <w:r>
         <w:lastRenderedPageBreak/>
-        <w:t>and OneHotEncoder preprocessing steps alongside the chosen classifier—was serialized together as model.pkl to ensure full reproducibility. Additionally, all environment dependencies and exact versions were strictly pinned in requirements.txt.</w:t>
+        <w:t xml:space="preserve">and </w:t>
+      </w:r>
+      <w:proofErr w:type="spellStart"/>
+      <w:r>
+        <w:t>OneHotEncoder</w:t>
+      </w:r>
+      <w:proofErr w:type="spellEnd"/>
+      <w:r>
+        <w:t xml:space="preserve"> preprocessing steps alongside the chosen classifier—was serialized together as </w:t>
+      </w:r>
+      <w:proofErr w:type="spellStart"/>
+      <w:r>
+        <w:t>model.pkl</w:t>
+      </w:r>
+      <w:proofErr w:type="spellEnd"/>
+      <w:r>
+        <w:t xml:space="preserve"> to ensure full reproducibility. Additionally, all environment dependencies and exact versions were strictly pinned in requirements.txt.</w:t>
       </w:r>
     </w:p>
     <w:p>
@@ -1235,7 +1427,15 @@
         <w:t>F</w:t>
       </w:r>
       <w:r>
-        <w:t>igure 6: MLflow Artifacts UI displaying the logged Confusion Matrix for the selected model.</w:t>
+        <w:t xml:space="preserve">igure 6: </w:t>
+      </w:r>
+      <w:proofErr w:type="spellStart"/>
+      <w:r>
+        <w:t>MLflow</w:t>
+      </w:r>
+      <w:proofErr w:type="spellEnd"/>
+      <w:r>
+        <w:t xml:space="preserve"> Artifacts UI displaying the logged Confusion Matrix for the selected model.</w:t>
       </w:r>
     </w:p>
     <w:p>
@@ -1301,7 +1501,15 @@
     </w:p>
     <w:p>
       <w:r>
-        <w:t>Figure 7: MLflow Artifacts UI displaying the logged ROC Curve evaluation plot.</w:t>
+        <w:t xml:space="preserve">Figure 7: </w:t>
+      </w:r>
+      <w:proofErr w:type="spellStart"/>
+      <w:r>
+        <w:t>MLflow</w:t>
+      </w:r>
+      <w:proofErr w:type="spellEnd"/>
+      <w:r>
+        <w:t xml:space="preserve"> Artifacts UI displaying the logged ROC Curve evaluation plot.</w:t>
       </w:r>
     </w:p>
     <w:p>
@@ -1371,7 +1579,15 @@
         </w:rPr>
       </w:pPr>
       <w:r>
-        <w:t>Additionally, visual evaluation plots including the Confusion Matrix and ROC Curve were automatically generated and logged as run artifacts in MLflow to enable comprehensive performance analysis.</w:t>
+        <w:t xml:space="preserve">Additionally, visual evaluation plots including the Confusion Matrix and ROC Curve were automatically generated and logged as run artifacts in </w:t>
+      </w:r>
+      <w:proofErr w:type="spellStart"/>
+      <w:r>
+        <w:t>MLflow</w:t>
+      </w:r>
+      <w:proofErr w:type="spellEnd"/>
+      <w:r>
+        <w:t xml:space="preserve"> to enable comprehensive performance analysis.</w:t>
       </w:r>
     </w:p>
     <w:p>
@@ -1385,7 +1601,39 @@
     </w:p>
     <w:p>
       <w:r>
-        <w:t>To ensure the reliability of the trained model, unit tests were implemented using pytest. The comprehensive test suite verified model existence, binary prediction constraints, data loading, and API payload validation. A Continuous Integration (CI) pipeline was established using GitHub Actions (ci.yml). This workflow automatically provisions an Ubuntu server, installs dependencies, executes flake8 linting, runs the pytest suite, executes model training, and packages the trained model.pkl as an automated deployment artifact upon every push to the main branch</w:t>
+        <w:t xml:space="preserve">To ensure the reliability of the trained model, unit tests were implemented using </w:t>
+      </w:r>
+      <w:proofErr w:type="spellStart"/>
+      <w:r>
+        <w:t>pytest</w:t>
+      </w:r>
+      <w:proofErr w:type="spellEnd"/>
+      <w:r>
+        <w:t>. The comprehensive test suite verified model existence, binary prediction constraints, data loading, and API payload validation. A Continuous Integration (CI) pipeline was established using GitHub Actions (</w:t>
+      </w:r>
+      <w:proofErr w:type="spellStart"/>
+      <w:r>
+        <w:t>ci.yml</w:t>
+      </w:r>
+      <w:proofErr w:type="spellEnd"/>
+      <w:r>
+        <w:t xml:space="preserve">). This workflow automatically provisions an Ubuntu server, installs dependencies, executes flake8 linting, runs the </w:t>
+      </w:r>
+      <w:proofErr w:type="spellStart"/>
+      <w:r>
+        <w:t>pytest</w:t>
+      </w:r>
+      <w:proofErr w:type="spellEnd"/>
+      <w:r>
+        <w:t xml:space="preserve"> suite, executes model training, and packages the trained </w:t>
+      </w:r>
+      <w:proofErr w:type="spellStart"/>
+      <w:r>
+        <w:t>model.pkl</w:t>
+      </w:r>
+      <w:proofErr w:type="spellEnd"/>
+      <w:r>
+        <w:t xml:space="preserve"> as an automated deployment artifact upon every push to the main branch</w:t>
       </w:r>
       <w:r>
         <w:t>.</w:t>
@@ -1395,8 +1643,13 @@
       <w:pPr>
         <w:pStyle w:val="ListBullet"/>
       </w:pPr>
+      <w:proofErr w:type="spellStart"/>
       <w:r>
-        <w:t>Pytest Execution:</w:t>
+        <w:t>Pytest</w:t>
+      </w:r>
+      <w:proofErr w:type="spellEnd"/>
+      <w:r>
+        <w:t xml:space="preserve"> Execution:</w:t>
       </w:r>
     </w:p>
     <w:p>
@@ -1415,7 +1668,15 @@
         <w:t>8</w:t>
       </w:r>
       <w:r>
-        <w:t>: Local Pytest execution showing all tests passing</w:t>
+        <w:t xml:space="preserve">: Local </w:t>
+      </w:r>
+      <w:proofErr w:type="spellStart"/>
+      <w:r>
+        <w:t>Pytest</w:t>
+      </w:r>
+      <w:proofErr w:type="spellEnd"/>
+      <w:r>
+        <w:t xml:space="preserve"> execution showing all tests passing</w:t>
       </w:r>
     </w:p>
     <w:p>
@@ -1465,7 +1726,23 @@
         <w:pStyle w:val="ListBullet"/>
       </w:pPr>
       <w:r>
-        <w:t>A Continuous Integration (CI) pipeline was established using GitHub Actions (ci.yml). This workflow automatically provisions an Ubuntu server, installs dependencies, executes flake8 linting, runs the pytest suite, and executes model training upon every push to the main branch.</w:t>
+        <w:t>A Continuous Integration (CI) pipeline was established using GitHub Actions (</w:t>
+      </w:r>
+      <w:proofErr w:type="spellStart"/>
+      <w:r>
+        <w:t>ci.yml</w:t>
+      </w:r>
+      <w:proofErr w:type="spellEnd"/>
+      <w:r>
+        <w:t xml:space="preserve">). This workflow automatically provisions an Ubuntu server, installs dependencies, executes flake8 linting, runs the </w:t>
+      </w:r>
+      <w:proofErr w:type="spellStart"/>
+      <w:r>
+        <w:t>pytest</w:t>
+      </w:r>
+      <w:proofErr w:type="spellEnd"/>
+      <w:r>
+        <w:t xml:space="preserve"> suite, and executes model training upon every push to the main branch.</w:t>
       </w:r>
     </w:p>
     <w:p>
@@ -1565,15 +1842,36 @@
     </w:p>
     <w:p>
       <w:r>
-        <w:t>The packaged Random Forest model was deployed as a RESTful API using the FastAPI framework. The Pydantic library was utilized to define the data schema and validate incoming JSON payloads.</w:t>
+        <w:t xml:space="preserve">The packaged Random Forest model was deployed as a RESTful API using the </w:t>
+      </w:r>
+      <w:proofErr w:type="spellStart"/>
+      <w:r>
+        <w:t>FastAPI</w:t>
+      </w:r>
+      <w:proofErr w:type="spellEnd"/>
+      <w:r>
+        <w:t xml:space="preserve"> framework. The </w:t>
+      </w:r>
+      <w:proofErr w:type="spellStart"/>
+      <w:r>
+        <w:t>Pydantic</w:t>
+      </w:r>
+      <w:proofErr w:type="spellEnd"/>
+      <w:r>
+        <w:t xml:space="preserve"> library was utilized to define the data schema and validate incoming JSON payloads.</w:t>
       </w:r>
     </w:p>
     <w:p>
       <w:pPr>
         <w:pStyle w:val="ListBullet"/>
       </w:pPr>
+      <w:proofErr w:type="spellStart"/>
       <w:r>
-        <w:t>FastAPI Swagger UI Testing:</w:t>
+        <w:t>FastAPI</w:t>
+      </w:r>
+      <w:proofErr w:type="spellEnd"/>
+      <w:r>
+        <w:t xml:space="preserve"> Swagger UI Testing:</w:t>
       </w:r>
     </w:p>
     <w:p>
@@ -1584,7 +1882,15 @@
         <w:t>10</w:t>
       </w:r>
       <w:r>
-        <w:t>: FastAPI Swagger UI demonstrating a successful prediction response</w:t>
+        <w:t xml:space="preserve">: </w:t>
+      </w:r>
+      <w:proofErr w:type="spellStart"/>
+      <w:r>
+        <w:t>FastAPI</w:t>
+      </w:r>
+      <w:proofErr w:type="spellEnd"/>
+      <w:r>
+        <w:t xml:space="preserve"> Swagger UI demonstrating a successful prediction response</w:t>
       </w:r>
     </w:p>
     <w:p>
@@ -1652,7 +1958,15 @@
     </w:p>
     <w:p>
       <w:r>
-        <w:t>To ensure cross-platform compatibility and ease of deployment, the entire application—including the Python runtime, dependencies, serialized model, and FastAPI server—was containerized using Docker.</w:t>
+        <w:t xml:space="preserve">To ensure cross-platform compatibility and ease of deployment, the entire application—including the Python runtime, dependencies, serialized model, and </w:t>
+      </w:r>
+      <w:proofErr w:type="spellStart"/>
+      <w:r>
+        <w:t>FastAPI</w:t>
+      </w:r>
+      <w:proofErr w:type="spellEnd"/>
+      <w:r>
+        <w:t xml:space="preserve"> server—was containerized using Docker.</w:t>
       </w:r>
     </w:p>
     <w:p>
@@ -1811,7 +2125,23 @@
     </w:p>
     <w:p>
       <w:r>
-        <w:t xml:space="preserve">To satisfy production monitoring requirements, the FastAPI application was instrumented using the prometheus-fastapi-instrumentator library. This automatically tracks API request </w:t>
+        <w:t xml:space="preserve">To satisfy production monitoring requirements, the </w:t>
+      </w:r>
+      <w:proofErr w:type="spellStart"/>
+      <w:r>
+        <w:t>FastAPI</w:t>
+      </w:r>
+      <w:proofErr w:type="spellEnd"/>
+      <w:r>
+        <w:t xml:space="preserve"> application was instrumented using the </w:t>
+      </w:r>
+      <w:proofErr w:type="spellStart"/>
+      <w:r>
+        <w:t>prometheus-fastapi-instrumentator</w:t>
+      </w:r>
+      <w:proofErr w:type="spellEnd"/>
+      <w:r>
+        <w:t xml:space="preserve"> library. This automatically tracks API request </w:t>
       </w:r>
       <w:r>
         <w:lastRenderedPageBreak/>
@@ -1886,7 +2216,15 @@
     </w:p>
     <w:p>
       <w:r>
-        <w:t>The /metrics endpoint dynamically exposes standard Prometheus-compatible metrics, including http_requests_total which accurately logs incoming /predict API traffic.</w:t>
+        <w:t xml:space="preserve">The /metrics endpoint dynamically exposes standard Prometheus-compatible metrics, including </w:t>
+      </w:r>
+      <w:proofErr w:type="spellStart"/>
+      <w:r>
+        <w:t>http_requests_total</w:t>
+      </w:r>
+      <w:proofErr w:type="spellEnd"/>
+      <w:r>
+        <w:t xml:space="preserve"> which accurately logs incoming /predict API traffic.</w:t>
       </w:r>
     </w:p>
     <w:p/>
@@ -1900,7 +2238,15 @@
         <w:t>4</w:t>
       </w:r>
       <w:r>
-        <w:t>: Prometheus UI dashboard successfully querying the scraped http_requests_total metric from the active /metrics endpoint.</w:t>
+        <w:t xml:space="preserve">: Prometheus UI dashboard successfully querying the scraped </w:t>
+      </w:r>
+      <w:proofErr w:type="spellStart"/>
+      <w:r>
+        <w:t>http_requests_total</w:t>
+      </w:r>
+      <w:proofErr w:type="spellEnd"/>
+      <w:r>
+        <w:t xml:space="preserve"> metric from the active /metrics endpoint.</w:t>
       </w:r>
     </w:p>
     <w:p>
@@ -1976,7 +2322,31 @@
     </w:p>
     <w:p>
       <w:r>
-        <w:t>To ensure high availability and scalability, the Dockerized API was deployed to a local Kubernetes cluster using a deployment manifest (k8s-manifest.yaml). The application was exposed to external traffic using a LoadBalancer service, fulfilling production-readiness requirements for cloud deployment.</w:t>
+        <w:t xml:space="preserve">To ensure high availability and scalability, the </w:t>
+      </w:r>
+      <w:proofErr w:type="spellStart"/>
+      <w:r>
+        <w:t>Dockerized</w:t>
+      </w:r>
+      <w:proofErr w:type="spellEnd"/>
+      <w:r>
+        <w:t xml:space="preserve"> API was deployed to a local Kubernetes cluster using a deployment manifest (k8s-</w:t>
+      </w:r>
+      <w:proofErr w:type="gramStart"/>
+      <w:r>
+        <w:t>manifest.yaml</w:t>
+      </w:r>
+      <w:proofErr w:type="gramEnd"/>
+      <w:r>
+        <w:t xml:space="preserve">). The application was exposed to external traffic using a </w:t>
+      </w:r>
+      <w:proofErr w:type="spellStart"/>
+      <w:r>
+        <w:t>LoadBalancer</w:t>
+      </w:r>
+      <w:proofErr w:type="spellEnd"/>
+      <w:r>
+        <w:t xml:space="preserve"> service, fulfilling production-readiness requirements for cloud deployment.</w:t>
       </w:r>
     </w:p>
     <w:p>
@@ -2066,7 +2436,15 @@
     </w:p>
     <w:p>
       <w:r>
-        <w:t xml:space="preserve">This project successfully implemented a complete MLOps lifecycle for heart disease prediction. The pipeline encompasses data ingestion and analysis, model training with experiment tracking, automated testing via CI/CD, containerization, deployment to a local Kubernetes cluster (Docker Desktop), and </w:t>
+        <w:t xml:space="preserve">This project successfully implemented a complete </w:t>
+      </w:r>
+      <w:proofErr w:type="spellStart"/>
+      <w:r>
+        <w:t>MLOps</w:t>
+      </w:r>
+      <w:proofErr w:type="spellEnd"/>
+      <w:r>
+        <w:t xml:space="preserve"> lifecycle for heart disease prediction. The pipeline encompasses data ingestion and analysis, model training with experiment tracking, automated testing via CI/CD, containerization, deployment to a local Kubernetes cluster (Docker Desktop), and </w:t>
       </w:r>
       <w:r>
         <w:t>Prometheus-compatible metric exposure</w:t>
@@ -3007,7 +3385,6 @@
   <w:style w:type="character" w:default="1" w:styleId="DefaultParagraphFont">
     <w:name w:val="Default Paragraph Font"/>
     <w:uiPriority w:val="1"/>
-    <w:semiHidden/>
     <w:unhideWhenUsed/>
   </w:style>
   <w:style w:type="table" w:default="1" w:styleId="TableNormal">

</xml_diff>